<commit_message>
Report: remove em and en dashes
Co-Authored-By: Claude Opus 5.5 <noreply@anthropic.com>
Claude-Session: https://claude.ai/code/session_01K3tmSGjrW2ZtNbngsCQ79f
</commit_message>
<xml_diff>
--- a/SmartCampus_MapReduce_Python/SmartCampus_MapReduce_Report.docx
+++ b/SmartCampus_MapReduce_Python/SmartCampus_MapReduce_Report.docx
@@ -229,7 +229,7 @@
         <w:t xml:space="preserve"> </w:t>
       </w:r>
       <w:r>
-        <w:t xml:space="preserve">10–14 Aug 2026. It contains 700 Wi-Fi sessions, 300 canteen transactions (594 item lines),</w:t>
+        <w:t xml:space="preserve">10-14 Aug 2026. It contains 700 Wi-Fi sessions, 300 canteen transactions (594 item lines),</w:t>
       </w:r>
       <w:r>
         <w:t xml:space="preserve"> </w:t>
@@ -1910,7 +1910,7 @@
         <w:pStyle w:val="Heading2"/>
       </w:pPr>
       <w:r>
-        <w:t xml:space="preserve">Job 1 — Peak Wi-Fi Usage (64 hourly keys)</w:t>
+        <w:t xml:space="preserve">Job 1: Peak Wi-Fi Usage (64 hourly keys)</w:t>
       </w:r>
     </w:p>
     <w:tbl>
@@ -2236,7 +2236,7 @@
         <w:pStyle w:val="Heading2"/>
       </w:pPr>
       <w:r>
-        <w:t xml:space="preserve">Job 2 — Access Point Utilisation</w:t>
+        <w:t xml:space="preserve">Job 2: Access Point Utilisation</w:t>
       </w:r>
     </w:p>
     <w:tbl>
@@ -2852,7 +2852,7 @@
         <w:t xml:space="preserve"> </w:t>
       </w:r>
       <w:r>
-        <w:t xml:space="preserve">length is similar everywhere (58–65 min), so the difference in load comes from the</w:t>
+        <w:t xml:space="preserve">length is similar everywhere (58-65 min), so the difference in load comes from the</w:t>
       </w:r>
       <w:r>
         <w:t xml:space="preserve"> </w:t>
@@ -2895,7 +2895,7 @@
         <w:pStyle w:val="Heading2"/>
       </w:pPr>
       <w:r>
-        <w:t xml:space="preserve">Job 3 — Canteen Item Frequency</w:t>
+        <w:t xml:space="preserve">Job 3: Canteen Item Frequency</w:t>
       </w:r>
     </w:p>
     <w:tbl>
@@ -3453,7 +3453,7 @@
         <w:pStyle w:val="Heading2"/>
       </w:pPr>
       <w:r>
-        <w:t xml:space="preserve">Job 4 — Top Co-Purchased Pairs (45 distinct pairs from 392 pair records)</w:t>
+        <w:t xml:space="preserve">Job 4: Top Co-Purchased Pairs (45 distinct pairs from 392 pair records)</w:t>
       </w:r>
     </w:p>
     <w:tbl>
@@ -3773,7 +3773,7 @@
         <w:pStyle w:val="Heading2"/>
       </w:pPr>
       <w:r>
-        <w:t xml:space="preserve">Job 5 — Library Usage Anomaly</w:t>
+        <w:t xml:space="preserve">Job 5: Library Usage Anomaly</w:t>
       </w:r>
     </w:p>
     <w:p>
@@ -4059,7 +4059,7 @@
         <w:pStyle w:val="Heading2"/>
       </w:pPr>
       <w:r>
-        <w:t xml:space="preserve">Job 6 — Transport Congestion (70 route-hours, 14 congested)</w:t>
+        <w:t xml:space="preserve">Job 6: Transport Congestion (70 route-hours, 14 congested)</w:t>
       </w:r>
     </w:p>
     <w:tbl>
@@ -4265,13 +4265,13 @@
         <w:t xml:space="preserve"> </w:t>
       </w:r>
       <w:r>
-        <w:t xml:space="preserve">slowest route overall and is congested in both rush hours. Adding R04 buses at 08:00–10:00 and</w:t>
-      </w:r>
-      <w:r>
-        <w:t xml:space="preserve"> </w:t>
-      </w:r>
-      <w:r>
-        <w:t xml:space="preserve">17:00–19:00, or staggering class start times, would ease the problem.</w:t>
+        <w:t xml:space="preserve">slowest route overall and is congested in both rush hours. Adding R04 buses at 08:00-10:00 and</w:t>
+      </w:r>
+      <w:r>
+        <w:t xml:space="preserve"> </w:t>
+      </w:r>
+      <w:r>
+        <w:t xml:space="preserve">17:00-19:00, or staggering class start times, would ease the problem.</w:t>
       </w:r>
     </w:p>
     <w:bookmarkEnd w:id="28"/>
@@ -4557,7 +4557,7 @@
               <w:jc w:val="left"/>
             </w:pPr>
             <w:r>
-              <w:t xml:space="preserve">Job 1 – Peak Wi-Fi</w:t>
+              <w:t xml:space="preserve">Job 1: Peak Wi-Fi</w:t>
             </w:r>
           </w:p>
         </w:tc>
@@ -4623,7 +4623,7 @@
               <w:jc w:val="left"/>
             </w:pPr>
             <w:r>
-              <w:t xml:space="preserve">Job 2 – Access Point</w:t>
+              <w:t xml:space="preserve">Job 2: Access Point</w:t>
             </w:r>
           </w:p>
         </w:tc>
@@ -4689,7 +4689,7 @@
               <w:jc w:val="left"/>
             </w:pPr>
             <w:r>
-              <w:t xml:space="preserve">Job 3 – Canteen</w:t>
+              <w:t xml:space="preserve">Job 3: Canteen</w:t>
             </w:r>
           </w:p>
         </w:tc>
@@ -4774,7 +4774,7 @@
               <w:jc w:val="left"/>
             </w:pPr>
             <w:r>
-              <w:t xml:space="preserve">Job 4 – Co-Purchase</w:t>
+              <w:t xml:space="preserve">Job 4: Co-Purchase</w:t>
             </w:r>
           </w:p>
         </w:tc>
@@ -4840,7 +4840,7 @@
               <w:jc w:val="left"/>
             </w:pPr>
             <w:r>
-              <w:t xml:space="preserve">Job 5 – Library</w:t>
+              <w:t xml:space="preserve">Job 5: Library</w:t>
             </w:r>
           </w:p>
         </w:tc>
@@ -4909,7 +4909,7 @@
               <w:jc w:val="left"/>
             </w:pPr>
             <w:r>
-              <w:t xml:space="preserve">Job 6 – Transport</w:t>
+              <w:t xml:space="preserve">Job 6: Transport</w:t>
             </w:r>
           </w:p>
         </w:tc>
@@ -6397,7 +6397,7 @@
         <w:pStyle w:val="Heading1"/>
       </w:pPr>
       <w:r>
-        <w:t xml:space="preserve">7. Viva Questions — Prepared Answers</w:t>
+        <w:t xml:space="preserve">7. Viva Questions: Prepared Answers</w:t>
       </w:r>
     </w:p>
     <w:tbl>
@@ -7100,7 +7100,7 @@
               <w:t xml:space="preserve">src/job1_wifi_combiner.py</w:t>
             </w:r>
             <w:r>
-              <w:t xml:space="preserve">, used for Jobs 1–3, 4-s2, 5, 6.</w:t>
+              <w:t xml:space="preserve">, used for Jobs 1-3, 4-s2, 5, 6.</w:t>
             </w:r>
           </w:p>
         </w:tc>

</xml_diff>

<commit_message>
Report appendix: step-by-step trace of how every result was obtained
run_demo.py runs each job phase by phase (input, mapper, shuffle and sort,
combiner, reducer, answer) on any OS; build_report.py inserts its output,
the verification run and the combiner check into the report.
</commit_message>
<xml_diff>
--- a/SmartCampus_MapReduce_Python/SmartCampus_MapReduce_Report.docx
+++ b/SmartCampus_MapReduce_Python/SmartCampus_MapReduce_Report.docx
@@ -9498,6 +9498,4297 @@
       </w:r>
     </w:p>
     <w:bookmarkEnd w:id="35"/>
+    <w:bookmarkStart w:id="46" w:name="appendix-how-the-results-were-obtained"/>
+    <w:p>
+      <w:pPr>
+        <w:pStyle w:val="Heading1"/>
+      </w:pPr>
+      <w:r>
+        <w:t xml:space="preserve">10. Appendix: How the Results Were Obtained</w:t>
+      </w:r>
+    </w:p>
+    <w:p>
+      <w:pPr>
+        <w:pStyle w:val="FirstParagraph"/>
+      </w:pPr>
+      <w:r>
+        <w:t xml:space="preserve">This appendix shows the exact steps that produced every result in section 4. It shows the</w:t>
+      </w:r>
+      <w:r>
+        <w:t xml:space="preserve"> </w:t>
+      </w:r>
+      <w:r>
+        <w:t xml:space="preserve">command used, the number of lines, and sample lines at every phase of every job. It was</w:t>
+      </w:r>
+      <w:r>
+        <w:t xml:space="preserve"> </w:t>
+      </w:r>
+      <w:r>
+        <w:t xml:space="preserve">generated by running</w:t>
+      </w:r>
+      <w:r>
+        <w:t xml:space="preserve"> </w:t>
+      </w:r>
+      <w:r>
+        <w:rPr>
+          <w:rStyle w:val="VerbatimChar"/>
+        </w:rPr>
+        <w:t xml:space="preserve">run_demo.py</w:t>
+      </w:r>
+      <w:r>
+        <w:t xml:space="preserve">. Running the same command on any computer with Python 3</w:t>
+      </w:r>
+      <w:r>
+        <w:t xml:space="preserve"> </w:t>
+      </w:r>
+      <w:r>
+        <w:t xml:space="preserve">gives the same output, because the dataset is seeded.</w:t>
+      </w:r>
+    </w:p>
+    <w:bookmarkStart w:id="36" w:name="how-to-run-it"/>
+    <w:p>
+      <w:pPr>
+        <w:pStyle w:val="Heading2"/>
+      </w:pPr>
+      <w:r>
+        <w:t xml:space="preserve">How to Run It</w:t>
+      </w:r>
+    </w:p>
+    <w:tbl>
+      <w:tblPr>
+        <w:tblStyle w:val="Table"/>
+        <w:tblW w:type="pct" w:w="5000"/>
+        <w:tblLook w:firstRow="1" w:lastRow="0" w:firstColumn="0" w:lastColumn="0" w:noHBand="0" w:noVBand="0" w:val="0020"/>
+        <w:jc w:val="start"/>
+        <w:tblBorders>
+          <w:top w:val="single" w:sz="4" w:space="0" w:color="000000"/>
+          <w:left w:val="single" w:sz="4" w:space="0" w:color="000000"/>
+          <w:bottom w:val="single" w:sz="4" w:space="0" w:color="000000"/>
+          <w:right w:val="single" w:sz="4" w:space="0" w:color="000000"/>
+          <w:insideH w:val="single" w:sz="4" w:space="0" w:color="000000"/>
+          <w:insideV w:val="single" w:sz="4" w:space="0" w:color="000000"/>
+        </w:tblBorders>
+      </w:tblPr>
+      <w:tblGrid>
+        <w:gridCol w:w="609"/>
+        <w:gridCol w:w="3452"/>
+        <w:gridCol w:w="3858"/>
+      </w:tblGrid>
+      <w:tr>
+        <w:trPr>
+          <w:tblHeader w:val="true"/>
+        </w:trPr>
+        <w:tc>
+          <w:tcPr/>
+          <w:p>
+            <w:pPr>
+              <w:pStyle w:val="Compact"/>
+              <w:spacing w:before="40" w:after="40"/>
+              <w:jc w:val="left"/>
+            </w:pPr>
+            <w:r>
+              <w:rPr>
+                <w:b/>
+                <w:sz w:val="22"/>
+              </w:rPr>
+              <w:t xml:space="preserve">Step</w:t>
+            </w:r>
+          </w:p>
+        </w:tc>
+        <w:tc>
+          <w:tcPr/>
+          <w:p>
+            <w:pPr>
+              <w:pStyle w:val="Compact"/>
+              <w:spacing w:before="40" w:after="40"/>
+              <w:jc w:val="left"/>
+            </w:pPr>
+            <w:r>
+              <w:rPr>
+                <w:b/>
+                <w:sz w:val="22"/>
+              </w:rPr>
+              <w:t xml:space="preserve">Command</w:t>
+            </w:r>
+          </w:p>
+        </w:tc>
+        <w:tc>
+          <w:tcPr/>
+          <w:p>
+            <w:pPr>
+              <w:pStyle w:val="Compact"/>
+              <w:spacing w:before="40" w:after="40"/>
+              <w:jc w:val="left"/>
+            </w:pPr>
+            <w:r>
+              <w:rPr>
+                <w:b/>
+                <w:sz w:val="22"/>
+              </w:rPr>
+              <w:t xml:space="preserve">What it does</w:t>
+            </w:r>
+          </w:p>
+        </w:tc>
+      </w:tr>
+      <w:tr>
+        <w:tc>
+          <w:tcPr/>
+          <w:p>
+            <w:pPr>
+              <w:pStyle w:val="Compact"/>
+              <w:spacing w:before="40" w:after="40"/>
+              <w:jc w:val="left"/>
+            </w:pPr>
+            <w:r>
+              <w:rPr>
+                <w:sz w:val="22"/>
+              </w:rPr>
+              <w:t xml:space="preserve">1</w:t>
+            </w:r>
+          </w:p>
+        </w:tc>
+        <w:tc>
+          <w:tcPr/>
+          <w:p>
+            <w:pPr>
+              <w:pStyle w:val="Compact"/>
+              <w:spacing w:before="40" w:after="40"/>
+              <w:jc w:val="left"/>
+            </w:pPr>
+            <w:r>
+              <w:rPr>
+                <w:rStyle w:val="VerbatimChar"/>
+                <w:sz w:val="22"/>
+              </w:rPr>
+              <w:t xml:space="preserve">cd SmartCampus_MapReduce_Python</w:t>
+            </w:r>
+          </w:p>
+        </w:tc>
+        <w:tc>
+          <w:tcPr/>
+          <w:p>
+            <w:pPr>
+              <w:pStyle w:val="Compact"/>
+              <w:spacing w:before="40" w:after="40"/>
+              <w:jc w:val="left"/>
+            </w:pPr>
+            <w:r>
+              <w:rPr>
+                <w:sz w:val="22"/>
+              </w:rPr>
+              <w:t xml:space="preserve">Open the project folder (after unzipping).</w:t>
+            </w:r>
+          </w:p>
+        </w:tc>
+      </w:tr>
+      <w:tr>
+        <w:tc>
+          <w:tcPr/>
+          <w:p>
+            <w:pPr>
+              <w:pStyle w:val="Compact"/>
+              <w:spacing w:before="40" w:after="40"/>
+              <w:jc w:val="left"/>
+            </w:pPr>
+            <w:r>
+              <w:rPr>
+                <w:sz w:val="22"/>
+              </w:rPr>
+              <w:t xml:space="preserve">2</w:t>
+            </w:r>
+          </w:p>
+        </w:tc>
+        <w:tc>
+          <w:tcPr/>
+          <w:p>
+            <w:pPr>
+              <w:pStyle w:val="Compact"/>
+              <w:spacing w:before="40" w:after="40"/>
+              <w:jc w:val="left"/>
+            </w:pPr>
+            <w:r>
+              <w:rPr>
+                <w:rStyle w:val="VerbatimChar"/>
+                <w:sz w:val="22"/>
+              </w:rPr>
+              <w:t xml:space="preserve">python run_demo.py</w:t>
+            </w:r>
+          </w:p>
+        </w:tc>
+        <w:tc>
+          <w:tcPr/>
+          <w:p>
+            <w:pPr>
+              <w:pStyle w:val="Compact"/>
+              <w:spacing w:before="40" w:after="40"/>
+              <w:jc w:val="left"/>
+            </w:pPr>
+            <w:r>
+              <w:rPr>
+                <w:sz w:val="22"/>
+              </w:rPr>
+              <w:t xml:space="preserve">Runs all six jobs phase by phase and prints this trace. Use</w:t>
+            </w:r>
+            <w:r>
+              <w:rPr>
+                <w:sz w:val="22"/>
+              </w:rPr>
+              <w:t xml:space="preserve"> </w:t>
+            </w:r>
+            <w:r>
+              <w:rPr>
+                <w:rStyle w:val="VerbatimChar"/>
+                <w:sz w:val="22"/>
+              </w:rPr>
+              <w:t xml:space="preserve">python run_demo.py 4</w:t>
+            </w:r>
+            <w:r>
+              <w:rPr>
+                <w:sz w:val="22"/>
+              </w:rPr>
+              <w:t xml:space="preserve"> </w:t>
+            </w:r>
+            <w:r>
+              <w:rPr>
+                <w:sz w:val="22"/>
+              </w:rPr>
+              <w:t xml:space="preserve">for one job. Works on Windows, macOS and Linux.</w:t>
+            </w:r>
+          </w:p>
+        </w:tc>
+      </w:tr>
+      <w:tr>
+        <w:tc>
+          <w:tcPr/>
+          <w:p>
+            <w:pPr>
+              <w:pStyle w:val="Compact"/>
+              <w:spacing w:before="40" w:after="40"/>
+              <w:jc w:val="left"/>
+            </w:pPr>
+            <w:r>
+              <w:rPr>
+                <w:sz w:val="22"/>
+              </w:rPr>
+              <w:t xml:space="preserve">3</w:t>
+            </w:r>
+          </w:p>
+        </w:tc>
+        <w:tc>
+          <w:tcPr/>
+          <w:p>
+            <w:pPr>
+              <w:pStyle w:val="Compact"/>
+              <w:spacing w:before="40" w:after="40"/>
+              <w:jc w:val="left"/>
+            </w:pPr>
+            <w:r>
+              <w:rPr>
+                <w:rStyle w:val="VerbatimChar"/>
+                <w:sz w:val="22"/>
+              </w:rPr>
+              <w:t xml:space="preserve">python scripts/verify.py</w:t>
+            </w:r>
+          </w:p>
+        </w:tc>
+        <w:tc>
+          <w:tcPr/>
+          <w:p>
+            <w:pPr>
+              <w:pStyle w:val="Compact"/>
+              <w:spacing w:before="40" w:after="40"/>
+              <w:jc w:val="left"/>
+            </w:pPr>
+            <w:r>
+              <w:rPr>
+                <w:sz w:val="22"/>
+              </w:rPr>
+              <w:t xml:space="preserve">Recomputes every answer directly from the CSV files without MapReduce and prints PASS or FAIL per job.</w:t>
+            </w:r>
+          </w:p>
+        </w:tc>
+      </w:tr>
+      <w:tr>
+        <w:tc>
+          <w:tcPr/>
+          <w:p>
+            <w:pPr>
+              <w:pStyle w:val="Compact"/>
+              <w:spacing w:before="40" w:after="40"/>
+              <w:jc w:val="left"/>
+            </w:pPr>
+            <w:r>
+              <w:rPr>
+                <w:sz w:val="22"/>
+              </w:rPr>
+              <w:t xml:space="preserve">4</w:t>
+            </w:r>
+          </w:p>
+        </w:tc>
+        <w:tc>
+          <w:tcPr/>
+          <w:p>
+            <w:pPr>
+              <w:pStyle w:val="Compact"/>
+              <w:spacing w:before="40" w:after="40"/>
+              <w:jc w:val="left"/>
+            </w:pPr>
+            <w:r>
+              <w:rPr>
+                <w:rStyle w:val="VerbatimChar"/>
+                <w:sz w:val="22"/>
+              </w:rPr>
+              <w:t xml:space="preserve">./run_local.sh</w:t>
+            </w:r>
+          </w:p>
+        </w:tc>
+        <w:tc>
+          <w:tcPr/>
+          <w:p>
+            <w:pPr>
+              <w:pStyle w:val="Compact"/>
+              <w:spacing w:before="40" w:after="40"/>
+              <w:jc w:val="left"/>
+            </w:pPr>
+            <w:r>
+              <w:rPr>
+                <w:sz w:val="22"/>
+              </w:rPr>
+              <w:t xml:space="preserve">The same jobs as a Unix pipeline, the way Hadoop Streaming runs them:</w:t>
+            </w:r>
+            <w:r>
+              <w:rPr>
+                <w:sz w:val="22"/>
+              </w:rPr>
+              <w:t xml:space="preserve"> </w:t>
+            </w:r>
+            <w:r>
+              <w:rPr>
+                <w:rStyle w:val="VerbatimChar"/>
+                <w:sz w:val="22"/>
+              </w:rPr>
+              <w:t xml:space="preserve">mapper &lt; input \| sort \| combiner \| sort \| reducer</w:t>
+            </w:r>
+            <w:r>
+              <w:rPr>
+                <w:sz w:val="22"/>
+              </w:rPr>
+              <w:t xml:space="preserve">. Linux, macOS or Git Bash.</w:t>
+            </w:r>
+          </w:p>
+        </w:tc>
+      </w:tr>
+      <w:tr>
+        <w:tc>
+          <w:tcPr/>
+          <w:p>
+            <w:pPr>
+              <w:pStyle w:val="Compact"/>
+              <w:spacing w:before="40" w:after="40"/>
+              <w:jc w:val="left"/>
+            </w:pPr>
+            <w:r>
+              <w:rPr>
+                <w:sz w:val="22"/>
+              </w:rPr>
+              <w:t xml:space="preserve">5</w:t>
+            </w:r>
+          </w:p>
+        </w:tc>
+        <w:tc>
+          <w:tcPr/>
+          <w:p>
+            <w:pPr>
+              <w:pStyle w:val="Compact"/>
+              <w:spacing w:before="40" w:after="40"/>
+              <w:jc w:val="left"/>
+            </w:pPr>
+            <w:r>
+              <w:rPr>
+                <w:rStyle w:val="VerbatimChar"/>
+                <w:sz w:val="22"/>
+              </w:rPr>
+              <w:t xml:space="preserve">./run_hadoop.sh</w:t>
+            </w:r>
+          </w:p>
+        </w:tc>
+        <w:tc>
+          <w:tcPr/>
+          <w:p>
+            <w:pPr>
+              <w:pStyle w:val="Compact"/>
+              <w:spacing w:before="40" w:after="40"/>
+              <w:jc w:val="left"/>
+            </w:pPr>
+            <w:r>
+              <w:rPr>
+                <w:sz w:val="22"/>
+              </w:rPr>
+              <w:t xml:space="preserve">Submits the jobs to a Hadoop cluster with</w:t>
+            </w:r>
+            <w:r>
+              <w:rPr>
+                <w:sz w:val="22"/>
+              </w:rPr>
+              <w:t xml:space="preserve"> </w:t>
+            </w:r>
+            <w:r>
+              <w:rPr>
+                <w:rStyle w:val="VerbatimChar"/>
+                <w:sz w:val="22"/>
+              </w:rPr>
+              <w:t xml:space="preserve">hadoop-streaming.jar</w:t>
+            </w:r>
+            <w:r>
+              <w:rPr>
+                <w:sz w:val="22"/>
+              </w:rPr>
+              <w:t xml:space="preserve">.</w:t>
+            </w:r>
+          </w:p>
+        </w:tc>
+      </w:tr>
+    </w:tbl>
+    <w:p>
+      <w:pPr>
+        <w:pStyle w:val="BodyText"/>
+        <w:spacing w:before="200"/>
+      </w:pPr>
+      <w:r>
+        <w:t xml:space="preserve">To test one mapper or reducer by hand, as section 7 of the worksheet describes:</w:t>
+      </w:r>
+    </w:p>
+    <w:p>
+      <w:pPr>
+        <w:pStyle w:val="SourceCode"/>
+      </w:pPr>
+      <w:r>
+        <w:rPr>
+          <w:rStyle w:val="VerbatimChar"/>
+        </w:rPr>
+        <w:t xml:space="preserve">$ cat data/wifi_logs.csv | python3 src/job1_wifi_mapper.py</w:t>
+      </w:r>
+      <w:r>
+        <w:br/>
+      </w:r>
+      <w:r>
+        <w:rPr>
+          <w:rStyle w:val="VerbatimChar"/>
+        </w:rPr>
+        <w:t xml:space="preserve">$ cat data/wifi_logs.csv | python3 src/job1_wifi_mapper.py | sort</w:t>
+      </w:r>
+      <w:r>
+        <w:br/>
+      </w:r>
+      <w:r>
+        <w:rPr>
+          <w:rStyle w:val="VerbatimChar"/>
+        </w:rPr>
+        <w:t xml:space="preserve">$ cat data/wifi_logs.csv | python3 src/job1_wifi_mapper.py | sort | python3 src/job1_wifi_reducer.py</w:t>
+      </w:r>
+    </w:p>
+    <w:bookmarkEnd w:id="36"/>
+    <w:bookmarkStart w:id="37" w:name="reading-the-trace"/>
+    <w:p>
+      <w:pPr>
+        <w:pStyle w:val="Heading2"/>
+      </w:pPr>
+      <w:r>
+        <w:t xml:space="preserve">Reading the Trace</w:t>
+      </w:r>
+    </w:p>
+    <w:p>
+      <w:pPr>
+        <w:pStyle w:val="FirstParagraph"/>
+      </w:pPr>
+      <w:r>
+        <w:t xml:space="preserve">Each job is shown as the phases of MapReduce.</w:t>
+      </w:r>
+      <w:r>
+        <w:t xml:space="preserve"> </w:t>
+      </w:r>
+      <w:r>
+        <w:rPr>
+          <w:bCs/>
+          <w:b/>
+        </w:rPr>
+        <w:t xml:space="preserve">Input</w:t>
+      </w:r>
+      <w:r>
+        <w:t xml:space="preserve"> </w:t>
+      </w:r>
+      <w:r>
+        <w:t xml:space="preserve">is the raw CSV, including its header</w:t>
+      </w:r>
+      <w:r>
+        <w:t xml:space="preserve"> </w:t>
+      </w:r>
+      <w:r>
+        <w:t xml:space="preserve">line.</w:t>
+      </w:r>
+      <w:r>
+        <w:t xml:space="preserve"> </w:t>
+      </w:r>
+      <w:r>
+        <w:rPr>
+          <w:bCs/>
+          <w:b/>
+        </w:rPr>
+        <w:t xml:space="preserve">Mapper output</w:t>
+      </w:r>
+      <w:r>
+        <w:t xml:space="preserve"> </w:t>
+      </w:r>
+      <w:r>
+        <w:t xml:space="preserve">gives one</w:t>
+      </w:r>
+      <w:r>
+        <w:t xml:space="preserve"> </w:t>
+      </w:r>
+      <w:r>
+        <w:rPr>
+          <w:rStyle w:val="VerbatimChar"/>
+        </w:rPr>
+        <w:t xml:space="preserve">key value</w:t>
+      </w:r>
+      <w:r>
+        <w:t xml:space="preserve"> </w:t>
+      </w:r>
+      <w:r>
+        <w:t xml:space="preserve">line per valid record; malformed lines are rejected</w:t>
+      </w:r>
+      <w:r>
+        <w:t xml:space="preserve"> </w:t>
+      </w:r>
+      <w:r>
+        <w:t xml:space="preserve">here.</w:t>
+      </w:r>
+      <w:r>
+        <w:t xml:space="preserve"> </w:t>
+      </w:r>
+      <w:r>
+        <w:rPr>
+          <w:bCs/>
+          <w:b/>
+        </w:rPr>
+        <w:t xml:space="preserve">Shuffle &amp; Sort</w:t>
+      </w:r>
+      <w:r>
+        <w:t xml:space="preserve"> </w:t>
+      </w:r>
+      <w:r>
+        <w:t xml:space="preserve">puts equal keys next to each other; this is what Hadoop does between the</w:t>
+      </w:r>
+      <w:r>
+        <w:t xml:space="preserve"> </w:t>
+      </w:r>
+      <w:r>
+        <w:t xml:space="preserve">two phases.</w:t>
+      </w:r>
+      <w:r>
+        <w:t xml:space="preserve"> </w:t>
+      </w:r>
+      <w:r>
+        <w:rPr>
+          <w:bCs/>
+          <w:b/>
+        </w:rPr>
+        <w:t xml:space="preserve">Combiner</w:t>
+      </w:r>
+      <w:r>
+        <w:t xml:space="preserve"> </w:t>
+      </w:r>
+      <w:r>
+        <w:t xml:space="preserve">pre-adds the values of each key (in this single-machine demo it sees all</w:t>
+      </w:r>
+      <w:r>
+        <w:t xml:space="preserve"> </w:t>
+      </w:r>
+      <w:r>
+        <w:t xml:space="preserve">the data at once, so it already gives one line per key; on a cluster it runs once per map task).</w:t>
+      </w:r>
+      <w:r>
+        <w:t xml:space="preserve"> </w:t>
+      </w:r>
+      <w:r>
+        <w:rPr>
+          <w:bCs/>
+          <w:b/>
+        </w:rPr>
+        <w:t xml:space="preserve">Reducer output</w:t>
+      </w:r>
+      <w:r>
+        <w:t xml:space="preserve"> </w:t>
+      </w:r>
+      <w:r>
+        <w:t xml:space="preserve">is the final result per key.</w:t>
+      </w:r>
+      <w:r>
+        <w:t xml:space="preserve"> </w:t>
+      </w:r>
+      <w:r>
+        <w:rPr>
+          <w:bCs/>
+          <w:b/>
+        </w:rPr>
+        <w:t xml:space="preserve">Answer</w:t>
+      </w:r>
+      <w:r>
+        <w:t xml:space="preserve"> </w:t>
+      </w:r>
+      <w:r>
+        <w:t xml:space="preserve">is the line read off that result for</w:t>
+      </w:r>
+      <w:r>
+        <w:t xml:space="preserve"> </w:t>
+      </w:r>
+      <w:r>
+        <w:t xml:space="preserve">section 4.</w:t>
+      </w:r>
+    </w:p>
+    <w:bookmarkEnd w:id="37"/>
+    <w:bookmarkStart w:id="38" w:name="job-1-peak-wi-fi-usage"/>
+    <w:p>
+      <w:pPr>
+        <w:pStyle w:val="Heading2"/>
+      </w:pPr>
+      <w:r>
+        <w:t xml:space="preserve">Job 1: Peak Wi-Fi Usage</w:t>
+      </w:r>
+    </w:p>
+    <w:p>
+      <w:pPr>
+        <w:pStyle w:val="FirstParagraph"/>
+      </w:pPr>
+      <w:r>
+        <w:rPr>
+          <w:bCs/>
+          <w:b/>
+        </w:rPr>
+        <w:t xml:space="preserve">Job 1: input (data/wifi_logs.csv)</w:t>
+      </w:r>
+      <w:r>
+        <w:t xml:space="preserve"> </w:t>
+      </w:r>
+      <w:r>
+        <w:t xml:space="preserve">(704 lines)</w:t>
+      </w:r>
+    </w:p>
+    <w:p>
+      <w:pPr>
+        <w:pStyle w:val="SourceCode"/>
+      </w:pPr>
+      <w:r>
+        <w:rPr>
+          <w:rStyle w:val="VerbatimChar"/>
+        </w:rPr>
+        <w:t xml:space="preserve">$ head data/wifi_logs.csv</w:t>
+      </w:r>
+      <w:r>
+        <w:br/>
+      </w:r>
+      <w:r>
+        <w:rPr>
+          <w:rStyle w:val="VerbatimChar"/>
+        </w:rPr>
+        <w:t xml:space="preserve">StudentID,Timestamp,AccessPoint,DataMB,DurationMin</w:t>
+      </w:r>
+      <w:r>
+        <w:br/>
+      </w:r>
+      <w:r>
+        <w:rPr>
+          <w:rStyle w:val="VerbatimChar"/>
+        </w:rPr>
+        <w:t xml:space="preserve">S131,2026-08-10 08:03,AP03,375.6,85</w:t>
+      </w:r>
+      <w:r>
+        <w:br/>
+      </w:r>
+      <w:r>
+        <w:rPr>
+          <w:rStyle w:val="VerbatimChar"/>
+        </w:rPr>
+        <w:t xml:space="preserve">S127,2026-08-10 08:16,AP03,112.1,40</w:t>
+      </w:r>
+      <w:r>
+        <w:br/>
+      </w:r>
+      <w:r>
+        <w:rPr>
+          <w:rStyle w:val="VerbatimChar"/>
+        </w:rPr>
+        <w:t xml:space="preserve">... (701 more lines)</w:t>
+      </w:r>
+    </w:p>
+    <w:p>
+      <w:pPr>
+        <w:pStyle w:val="FirstParagraph"/>
+      </w:pPr>
+      <w:r>
+        <w:rPr>
+          <w:bCs/>
+          <w:b/>
+        </w:rPr>
+        <w:t xml:space="preserve">Job 1: Mapper output (key TAB value)</w:t>
+      </w:r>
+      <w:r>
+        <w:t xml:space="preserve"> </w:t>
+      </w:r>
+      <w:r>
+        <w:t xml:space="preserve">(700 lines)</w:t>
+      </w:r>
+    </w:p>
+    <w:p>
+      <w:pPr>
+        <w:pStyle w:val="SourceCode"/>
+      </w:pPr>
+      <w:r>
+        <w:rPr>
+          <w:rStyle w:val="VerbatimChar"/>
+        </w:rPr>
+        <w:t xml:space="preserve">$ python src/job1_wifi_mapper.py &lt; data/wifi_logs.csv</w:t>
+      </w:r>
+      <w:r>
+        <w:br/>
+      </w:r>
+      <w:r>
+        <w:rPr>
+          <w:rStyle w:val="VerbatimChar"/>
+        </w:rPr>
+        <w:t xml:space="preserve">2026-08-10-08    375.6,85.0,1</w:t>
+      </w:r>
+      <w:r>
+        <w:br/>
+      </w:r>
+      <w:r>
+        <w:rPr>
+          <w:rStyle w:val="VerbatimChar"/>
+        </w:rPr>
+        <w:t xml:space="preserve">2026-08-10-08    112.1,40.0,1</w:t>
+      </w:r>
+      <w:r>
+        <w:br/>
+      </w:r>
+      <w:r>
+        <w:rPr>
+          <w:rStyle w:val="VerbatimChar"/>
+        </w:rPr>
+        <w:t xml:space="preserve">2026-08-10-08    55.2,44.0,1</w:t>
+      </w:r>
+      <w:r>
+        <w:br/>
+      </w:r>
+      <w:r>
+        <w:rPr>
+          <w:rStyle w:val="VerbatimChar"/>
+        </w:rPr>
+        <w:t xml:space="preserve">... (697 more lines)</w:t>
+      </w:r>
+    </w:p>
+    <w:p>
+      <w:pPr>
+        <w:pStyle w:val="FirstParagraph"/>
+      </w:pPr>
+      <w:r>
+        <w:t xml:space="preserve">Malformed records rejected by the mapper:</w:t>
+      </w:r>
+      <w:r>
+        <w:t xml:space="preserve"> </w:t>
+      </w:r>
+      <w:r>
+        <w:rPr>
+          <w:bCs/>
+          <w:b/>
+        </w:rPr>
+        <w:t xml:space="preserve">2</w:t>
+      </w:r>
+    </w:p>
+    <w:p>
+      <w:pPr>
+        <w:pStyle w:val="BodyText"/>
+      </w:pPr>
+      <w:r>
+        <w:rPr>
+          <w:bCs/>
+          <w:b/>
+        </w:rPr>
+        <w:t xml:space="preserve">Job 1: after Shuffle &amp; Sort (grouped by key)</w:t>
+      </w:r>
+      <w:r>
+        <w:t xml:space="preserve"> </w:t>
+      </w:r>
+      <w:r>
+        <w:t xml:space="preserve">(700 lines)</w:t>
+      </w:r>
+    </w:p>
+    <w:p>
+      <w:pPr>
+        <w:pStyle w:val="SourceCode"/>
+      </w:pPr>
+      <w:r>
+        <w:rPr>
+          <w:rStyle w:val="VerbatimChar"/>
+        </w:rPr>
+        <w:t xml:space="preserve">$ ... | sort</w:t>
+      </w:r>
+      <w:r>
+        <w:br/>
+      </w:r>
+      <w:r>
+        <w:rPr>
+          <w:rStyle w:val="VerbatimChar"/>
+        </w:rPr>
+        <w:t xml:space="preserve">2026-08-10-08    112.1,40.0,1</w:t>
+      </w:r>
+      <w:r>
+        <w:br/>
+      </w:r>
+      <w:r>
+        <w:rPr>
+          <w:rStyle w:val="VerbatimChar"/>
+        </w:rPr>
+        <w:t xml:space="preserve">2026-08-10-08    250.3,66.0,1</w:t>
+      </w:r>
+      <w:r>
+        <w:br/>
+      </w:r>
+      <w:r>
+        <w:rPr>
+          <w:rStyle w:val="VerbatimChar"/>
+        </w:rPr>
+        <w:t xml:space="preserve">2026-08-10-08    375.6,85.0,1</w:t>
+      </w:r>
+      <w:r>
+        <w:br/>
+      </w:r>
+      <w:r>
+        <w:rPr>
+          <w:rStyle w:val="VerbatimChar"/>
+        </w:rPr>
+        <w:t xml:space="preserve">... (697 more lines)</w:t>
+      </w:r>
+    </w:p>
+    <w:p>
+      <w:pPr>
+        <w:pStyle w:val="FirstParagraph"/>
+      </w:pPr>
+      <w:r>
+        <w:rPr>
+          <w:bCs/>
+          <w:b/>
+        </w:rPr>
+        <w:t xml:space="preserve">Job 1: after Combiner (one partial sum per key)</w:t>
+      </w:r>
+      <w:r>
+        <w:t xml:space="preserve"> </w:t>
+      </w:r>
+      <w:r>
+        <w:t xml:space="preserve">(64 lines)</w:t>
+      </w:r>
+    </w:p>
+    <w:p>
+      <w:pPr>
+        <w:pStyle w:val="SourceCode"/>
+      </w:pPr>
+      <w:r>
+        <w:rPr>
+          <w:rStyle w:val="VerbatimChar"/>
+        </w:rPr>
+        <w:t xml:space="preserve">$ ... | sort | python src/job1_wifi_combiner.py</w:t>
+      </w:r>
+      <w:r>
+        <w:br/>
+      </w:r>
+      <w:r>
+        <w:rPr>
+          <w:rStyle w:val="VerbatimChar"/>
+        </w:rPr>
+        <w:t xml:space="preserve">2026-08-10-08    860.2,256,5</w:t>
+      </w:r>
+      <w:r>
+        <w:br/>
+      </w:r>
+      <w:r>
+        <w:rPr>
+          <w:rStyle w:val="VerbatimChar"/>
+        </w:rPr>
+        <w:t xml:space="preserve">2026-08-10-09    2647.9,926,12</w:t>
+      </w:r>
+      <w:r>
+        <w:br/>
+      </w:r>
+      <w:r>
+        <w:rPr>
+          <w:rStyle w:val="VerbatimChar"/>
+        </w:rPr>
+        <w:t xml:space="preserve">2026-08-10-10    1923.4,714,12</w:t>
+      </w:r>
+      <w:r>
+        <w:br/>
+      </w:r>
+      <w:r>
+        <w:rPr>
+          <w:rStyle w:val="VerbatimChar"/>
+        </w:rPr>
+        <w:t xml:space="preserve">... (61 more lines)</w:t>
+      </w:r>
+    </w:p>
+    <w:p>
+      <w:pPr>
+        <w:pStyle w:val="FirstParagraph"/>
+      </w:pPr>
+      <w:r>
+        <w:rPr>
+          <w:bCs/>
+          <w:b/>
+        </w:rPr>
+        <w:t xml:space="preserve">Job 1: Reducer output</w:t>
+      </w:r>
+      <w:r>
+        <w:t xml:space="preserve"> </w:t>
+      </w:r>
+      <w:r>
+        <w:t xml:space="preserve">(64 lines)</w:t>
+      </w:r>
+    </w:p>
+    <w:p>
+      <w:pPr>
+        <w:pStyle w:val="SourceCode"/>
+      </w:pPr>
+      <w:r>
+        <w:rPr>
+          <w:rStyle w:val="VerbatimChar"/>
+        </w:rPr>
+        <w:t xml:space="preserve">$ ... | sort | python src/job1_wifi_reducer.py</w:t>
+      </w:r>
+      <w:r>
+        <w:br/>
+      </w:r>
+      <w:r>
+        <w:rPr>
+          <w:rStyle w:val="VerbatimChar"/>
+        </w:rPr>
+        <w:t xml:space="preserve">2026-08-10-08    TotalDataMB=860.20,TotalDurationMin=256.00,Sessions=5</w:t>
+      </w:r>
+      <w:r>
+        <w:br/>
+      </w:r>
+      <w:r>
+        <w:rPr>
+          <w:rStyle w:val="VerbatimChar"/>
+        </w:rPr>
+        <w:t xml:space="preserve">2026-08-10-09    TotalDataMB=2647.90,TotalDurationMin=926.00,Sessions=12</w:t>
+      </w:r>
+      <w:r>
+        <w:br/>
+      </w:r>
+      <w:r>
+        <w:rPr>
+          <w:rStyle w:val="VerbatimChar"/>
+        </w:rPr>
+        <w:t xml:space="preserve">2026-08-10-10    TotalDataMB=1923.40,TotalDurationMin=714.00,Sessions=12</w:t>
+      </w:r>
+      <w:r>
+        <w:br/>
+      </w:r>
+      <w:r>
+        <w:rPr>
+          <w:rStyle w:val="VerbatimChar"/>
+        </w:rPr>
+        <w:t xml:space="preserve">... (61 more lines)</w:t>
+      </w:r>
+    </w:p>
+    <w:p>
+      <w:pPr>
+        <w:pStyle w:val="FirstParagraph"/>
+      </w:pPr>
+      <w:r>
+        <w:rPr>
+          <w:bCs/>
+          <w:b/>
+        </w:rPr>
+        <w:t xml:space="preserve">Answer: top 3 hours by TotalDataMB (first line = peak hour)</w:t>
+      </w:r>
+      <w:r>
+        <w:t xml:space="preserve"> </w:t>
+      </w:r>
+      <w:r>
+        <w:t xml:space="preserve">(3 lines)</w:t>
+      </w:r>
+    </w:p>
+    <w:p>
+      <w:pPr>
+        <w:pStyle w:val="SourceCode"/>
+      </w:pPr>
+      <w:r>
+        <w:rPr>
+          <w:rStyle w:val="VerbatimChar"/>
+        </w:rPr>
+        <w:t xml:space="preserve">2026-08-12-11    TotalDataMB=7872.10,TotalDurationMin=1744.00,Sessions=27</w:t>
+      </w:r>
+      <w:r>
+        <w:br/>
+      </w:r>
+      <w:r>
+        <w:rPr>
+          <w:rStyle w:val="VerbatimChar"/>
+        </w:rPr>
+        <w:t xml:space="preserve">2026-08-10-11    TotalDataMB=6469.60,TotalDurationMin=1784.00,Sessions=26</w:t>
+      </w:r>
+      <w:r>
+        <w:br/>
+      </w:r>
+      <w:r>
+        <w:rPr>
+          <w:rStyle w:val="VerbatimChar"/>
+        </w:rPr>
+        <w:t xml:space="preserve">2026-08-11-11    TotalDataMB=6130.50,TotalDurationMin=1327.00,Sessions=22</w:t>
+      </w:r>
+    </w:p>
+    <w:bookmarkEnd w:id="38"/>
+    <w:bookmarkStart w:id="39" w:name="job-2-access-point-utilisation-1"/>
+    <w:p>
+      <w:pPr>
+        <w:pStyle w:val="Heading2"/>
+      </w:pPr>
+      <w:r>
+        <w:t xml:space="preserve">Job 2: Access Point Utilisation</w:t>
+      </w:r>
+    </w:p>
+    <w:p>
+      <w:pPr>
+        <w:pStyle w:val="FirstParagraph"/>
+      </w:pPr>
+      <w:r>
+        <w:rPr>
+          <w:bCs/>
+          <w:b/>
+        </w:rPr>
+        <w:t xml:space="preserve">Job 2: input (data/wifi_logs.csv)</w:t>
+      </w:r>
+      <w:r>
+        <w:t xml:space="preserve"> </w:t>
+      </w:r>
+      <w:r>
+        <w:t xml:space="preserve">(704 lines)</w:t>
+      </w:r>
+    </w:p>
+    <w:p>
+      <w:pPr>
+        <w:pStyle w:val="SourceCode"/>
+      </w:pPr>
+      <w:r>
+        <w:rPr>
+          <w:rStyle w:val="VerbatimChar"/>
+        </w:rPr>
+        <w:t xml:space="preserve">$ head data/wifi_logs.csv</w:t>
+      </w:r>
+      <w:r>
+        <w:br/>
+      </w:r>
+      <w:r>
+        <w:rPr>
+          <w:rStyle w:val="VerbatimChar"/>
+        </w:rPr>
+        <w:t xml:space="preserve">StudentID,Timestamp,AccessPoint,DataMB,DurationMin</w:t>
+      </w:r>
+      <w:r>
+        <w:br/>
+      </w:r>
+      <w:r>
+        <w:rPr>
+          <w:rStyle w:val="VerbatimChar"/>
+        </w:rPr>
+        <w:t xml:space="preserve">S131,2026-08-10 08:03,AP03,375.6,85</w:t>
+      </w:r>
+      <w:r>
+        <w:br/>
+      </w:r>
+      <w:r>
+        <w:rPr>
+          <w:rStyle w:val="VerbatimChar"/>
+        </w:rPr>
+        <w:t xml:space="preserve">S127,2026-08-10 08:16,AP03,112.1,40</w:t>
+      </w:r>
+      <w:r>
+        <w:br/>
+      </w:r>
+      <w:r>
+        <w:rPr>
+          <w:rStyle w:val="VerbatimChar"/>
+        </w:rPr>
+        <w:t xml:space="preserve">... (701 more lines)</w:t>
+      </w:r>
+    </w:p>
+    <w:p>
+      <w:pPr>
+        <w:pStyle w:val="FirstParagraph"/>
+      </w:pPr>
+      <w:r>
+        <w:rPr>
+          <w:bCs/>
+          <w:b/>
+        </w:rPr>
+        <w:t xml:space="preserve">Job 2: Mapper output (key TAB value)</w:t>
+      </w:r>
+      <w:r>
+        <w:t xml:space="preserve"> </w:t>
+      </w:r>
+      <w:r>
+        <w:t xml:space="preserve">(700 lines)</w:t>
+      </w:r>
+    </w:p>
+    <w:p>
+      <w:pPr>
+        <w:pStyle w:val="SourceCode"/>
+      </w:pPr>
+      <w:r>
+        <w:rPr>
+          <w:rStyle w:val="VerbatimChar"/>
+        </w:rPr>
+        <w:t xml:space="preserve">$ python src/job2_ap_mapper.py &lt; data/wifi_logs.csv</w:t>
+      </w:r>
+      <w:r>
+        <w:br/>
+      </w:r>
+      <w:r>
+        <w:rPr>
+          <w:rStyle w:val="VerbatimChar"/>
+        </w:rPr>
+        <w:t xml:space="preserve">AP03    375.6,85.0,1</w:t>
+      </w:r>
+      <w:r>
+        <w:br/>
+      </w:r>
+      <w:r>
+        <w:rPr>
+          <w:rStyle w:val="VerbatimChar"/>
+        </w:rPr>
+        <w:t xml:space="preserve">AP03    112.1,40.0,1</w:t>
+      </w:r>
+      <w:r>
+        <w:br/>
+      </w:r>
+      <w:r>
+        <w:rPr>
+          <w:rStyle w:val="VerbatimChar"/>
+        </w:rPr>
+        <w:t xml:space="preserve">AP04    55.2,44.0,1</w:t>
+      </w:r>
+      <w:r>
+        <w:br/>
+      </w:r>
+      <w:r>
+        <w:rPr>
+          <w:rStyle w:val="VerbatimChar"/>
+        </w:rPr>
+        <w:t xml:space="preserve">... (697 more lines)</w:t>
+      </w:r>
+    </w:p>
+    <w:p>
+      <w:pPr>
+        <w:pStyle w:val="FirstParagraph"/>
+      </w:pPr>
+      <w:r>
+        <w:t xml:space="preserve">Malformed records rejected by the mapper:</w:t>
+      </w:r>
+      <w:r>
+        <w:t xml:space="preserve"> </w:t>
+      </w:r>
+      <w:r>
+        <w:rPr>
+          <w:bCs/>
+          <w:b/>
+        </w:rPr>
+        <w:t xml:space="preserve">2</w:t>
+      </w:r>
+    </w:p>
+    <w:p>
+      <w:pPr>
+        <w:pStyle w:val="BodyText"/>
+      </w:pPr>
+      <w:r>
+        <w:rPr>
+          <w:bCs/>
+          <w:b/>
+        </w:rPr>
+        <w:t xml:space="preserve">Job 2: after Shuffle &amp; Sort (grouped by key)</w:t>
+      </w:r>
+      <w:r>
+        <w:t xml:space="preserve"> </w:t>
+      </w:r>
+      <w:r>
+        <w:t xml:space="preserve">(700 lines)</w:t>
+      </w:r>
+    </w:p>
+    <w:p>
+      <w:pPr>
+        <w:pStyle w:val="SourceCode"/>
+      </w:pPr>
+      <w:r>
+        <w:rPr>
+          <w:rStyle w:val="VerbatimChar"/>
+        </w:rPr>
+        <w:t xml:space="preserve">$ ... | sort</w:t>
+      </w:r>
+      <w:r>
+        <w:br/>
+      </w:r>
+      <w:r>
+        <w:rPr>
+          <w:rStyle w:val="VerbatimChar"/>
+        </w:rPr>
+        <w:t xml:space="preserve">AP01    100.4,44.0,1</w:t>
+      </w:r>
+      <w:r>
+        <w:br/>
+      </w:r>
+      <w:r>
+        <w:rPr>
+          <w:rStyle w:val="VerbatimChar"/>
+        </w:rPr>
+        <w:t xml:space="preserve">AP01    101.3,33.0,1</w:t>
+      </w:r>
+      <w:r>
+        <w:br/>
+      </w:r>
+      <w:r>
+        <w:rPr>
+          <w:rStyle w:val="VerbatimChar"/>
+        </w:rPr>
+        <w:t xml:space="preserve">AP01    101.5,85.0,1</w:t>
+      </w:r>
+      <w:r>
+        <w:br/>
+      </w:r>
+      <w:r>
+        <w:rPr>
+          <w:rStyle w:val="VerbatimChar"/>
+        </w:rPr>
+        <w:t xml:space="preserve">... (697 more lines)</w:t>
+      </w:r>
+    </w:p>
+    <w:p>
+      <w:pPr>
+        <w:pStyle w:val="FirstParagraph"/>
+      </w:pPr>
+      <w:r>
+        <w:rPr>
+          <w:bCs/>
+          <w:b/>
+        </w:rPr>
+        <w:t xml:space="preserve">Job 2: after Combiner (one partial sum per key)</w:t>
+      </w:r>
+      <w:r>
+        <w:t xml:space="preserve"> </w:t>
+      </w:r>
+      <w:r>
+        <w:t xml:space="preserve">(8 lines)</w:t>
+      </w:r>
+    </w:p>
+    <w:p>
+      <w:pPr>
+        <w:pStyle w:val="SourceCode"/>
+      </w:pPr>
+      <w:r>
+        <w:rPr>
+          <w:rStyle w:val="VerbatimChar"/>
+        </w:rPr>
+        <w:t xml:space="preserve">$ ... | sort | python src/job1_wifi_combiner.py</w:t>
+      </w:r>
+      <w:r>
+        <w:br/>
+      </w:r>
+      <w:r>
+        <w:rPr>
+          <w:rStyle w:val="VerbatimChar"/>
+        </w:rPr>
+        <w:t xml:space="preserve">AP01    32703.2,10909,175</w:t>
+      </w:r>
+      <w:r>
+        <w:br/>
+      </w:r>
+      <w:r>
+        <w:rPr>
+          <w:rStyle w:val="VerbatimChar"/>
+        </w:rPr>
+        <w:t xml:space="preserve">AP02    15300.8,4996,78</w:t>
+      </w:r>
+      <w:r>
+        <w:br/>
+      </w:r>
+      <w:r>
+        <w:rPr>
+          <w:rStyle w:val="VerbatimChar"/>
+        </w:rPr>
+        <w:t xml:space="preserve">AP03    34825.6,11291,181</w:t>
+      </w:r>
+      <w:r>
+        <w:br/>
+      </w:r>
+      <w:r>
+        <w:rPr>
+          <w:rStyle w:val="VerbatimChar"/>
+        </w:rPr>
+        <w:t xml:space="preserve">... (5 more lines)</w:t>
+      </w:r>
+    </w:p>
+    <w:p>
+      <w:pPr>
+        <w:pStyle w:val="FirstParagraph"/>
+      </w:pPr>
+      <w:r>
+        <w:rPr>
+          <w:bCs/>
+          <w:b/>
+        </w:rPr>
+        <w:t xml:space="preserve">Job 2: Reducer output</w:t>
+      </w:r>
+      <w:r>
+        <w:t xml:space="preserve"> </w:t>
+      </w:r>
+      <w:r>
+        <w:t xml:space="preserve">(8 lines)</w:t>
+      </w:r>
+    </w:p>
+    <w:p>
+      <w:pPr>
+        <w:pStyle w:val="SourceCode"/>
+      </w:pPr>
+      <w:r>
+        <w:rPr>
+          <w:rStyle w:val="VerbatimChar"/>
+        </w:rPr>
+        <w:t xml:space="preserve">$ ... | sort | python src/job2_ap_reducer.py</w:t>
+      </w:r>
+      <w:r>
+        <w:br/>
+      </w:r>
+      <w:r>
+        <w:rPr>
+          <w:rStyle w:val="VerbatimChar"/>
+        </w:rPr>
+        <w:t xml:space="preserve">AP01    TotalDataMB=32703.20,TotalDurationMin=10909.00,Sessions=175,AvgSessionMin=62.34</w:t>
+      </w:r>
+      <w:r>
+        <w:br/>
+      </w:r>
+      <w:r>
+        <w:rPr>
+          <w:rStyle w:val="VerbatimChar"/>
+        </w:rPr>
+        <w:t xml:space="preserve">AP02    TotalDataMB=15300.80,TotalDurationMin=4996.00,Sessions=78,AvgSessionMin=64.05</w:t>
+      </w:r>
+      <w:r>
+        <w:br/>
+      </w:r>
+      <w:r>
+        <w:rPr>
+          <w:rStyle w:val="VerbatimChar"/>
+        </w:rPr>
+        <w:t xml:space="preserve">AP03    TotalDataMB=34825.60,TotalDurationMin=11291.00,Sessions=181,AvgSessionMin=62.38</w:t>
+      </w:r>
+      <w:r>
+        <w:br/>
+      </w:r>
+      <w:r>
+        <w:rPr>
+          <w:rStyle w:val="VerbatimChar"/>
+        </w:rPr>
+        <w:t xml:space="preserve">AP04    TotalDataMB=12753.00,TotalDurationMin=4100.00,Sessions=64,AvgSessionMin=64.06</w:t>
+      </w:r>
+      <w:r>
+        <w:br/>
+      </w:r>
+      <w:r>
+        <w:rPr>
+          <w:rStyle w:val="VerbatimChar"/>
+        </w:rPr>
+        <w:t xml:space="preserve">AP05    TotalDataMB=14845.80,TotalDurationMin=4966.00,Sessions=85,AvgSessionMin=58.42</w:t>
+      </w:r>
+      <w:r>
+        <w:br/>
+      </w:r>
+      <w:r>
+        <w:rPr>
+          <w:rStyle w:val="VerbatimChar"/>
+        </w:rPr>
+        <w:t xml:space="preserve">AP06    TotalDataMB=8939.40,TotalDurationMin=2547.00,Sessions=39,AvgSessionMin=65.31</w:t>
+      </w:r>
+      <w:r>
+        <w:br/>
+      </w:r>
+      <w:r>
+        <w:rPr>
+          <w:rStyle w:val="VerbatimChar"/>
+        </w:rPr>
+        <w:t xml:space="preserve">AP07    TotalDataMB=6735.10,TotalDurationMin=2028.00,Sessions=34,AvgSessionMin=59.65</w:t>
+      </w:r>
+      <w:r>
+        <w:br/>
+      </w:r>
+      <w:r>
+        <w:rPr>
+          <w:rStyle w:val="VerbatimChar"/>
+        </w:rPr>
+        <w:t xml:space="preserve">AP08    TotalDataMB=8359.90,TotalDurationMin=2631.00,Sessions=44,AvgSessionMin=59.80</w:t>
+      </w:r>
+    </w:p>
+    <w:p>
+      <w:pPr>
+        <w:pStyle w:val="FirstParagraph"/>
+      </w:pPr>
+      <w:r>
+        <w:rPr>
+          <w:bCs/>
+          <w:b/>
+        </w:rPr>
+        <w:t xml:space="preserve">Answer: busiest access point by TotalDataMB</w:t>
+      </w:r>
+      <w:r>
+        <w:t xml:space="preserve"> </w:t>
+      </w:r>
+      <w:r>
+        <w:t xml:space="preserve">(1 line)</w:t>
+      </w:r>
+    </w:p>
+    <w:p>
+      <w:pPr>
+        <w:pStyle w:val="SourceCode"/>
+      </w:pPr>
+      <w:r>
+        <w:rPr>
+          <w:rStyle w:val="VerbatimChar"/>
+        </w:rPr>
+        <w:t xml:space="preserve">AP03    TotalDataMB=34825.60,TotalDurationMin=11291.00,Sessions=181,AvgSessionMin=62.38</w:t>
+      </w:r>
+    </w:p>
+    <w:bookmarkEnd w:id="39"/>
+    <w:bookmarkStart w:id="40" w:name="job-3-canteen-item-frequency-1"/>
+    <w:p>
+      <w:pPr>
+        <w:pStyle w:val="Heading2"/>
+      </w:pPr>
+      <w:r>
+        <w:t xml:space="preserve">Job 3: Canteen Item Frequency</w:t>
+      </w:r>
+    </w:p>
+    <w:p>
+      <w:pPr>
+        <w:pStyle w:val="FirstParagraph"/>
+      </w:pPr>
+      <w:r>
+        <w:rPr>
+          <w:bCs/>
+          <w:b/>
+        </w:rPr>
+        <w:t xml:space="preserve">Job 3: input (data/canteen.csv)</w:t>
+      </w:r>
+      <w:r>
+        <w:t xml:space="preserve"> </w:t>
+      </w:r>
+      <w:r>
+        <w:t xml:space="preserve">(597 lines)</w:t>
+      </w:r>
+    </w:p>
+    <w:p>
+      <w:pPr>
+        <w:pStyle w:val="SourceCode"/>
+      </w:pPr>
+      <w:r>
+        <w:rPr>
+          <w:rStyle w:val="VerbatimChar"/>
+        </w:rPr>
+        <w:t xml:space="preserve">$ head data/canteen.csv</w:t>
+      </w:r>
+      <w:r>
+        <w:br/>
+      </w:r>
+      <w:r>
+        <w:rPr>
+          <w:rStyle w:val="VerbatimChar"/>
+        </w:rPr>
+        <w:t xml:space="preserve">TransactionID,Timestamp,StudentID,Item,Quantity,Amount</w:t>
+      </w:r>
+      <w:r>
+        <w:br/>
+      </w:r>
+      <w:r>
+        <w:rPr>
+          <w:rStyle w:val="VerbatimChar"/>
+        </w:rPr>
+        <w:t xml:space="preserve">T1001,2026-08-10 13:35,S149,Juice,1,50</w:t>
+      </w:r>
+      <w:r>
+        <w:br/>
+      </w:r>
+      <w:r>
+        <w:rPr>
+          <w:rStyle w:val="VerbatimChar"/>
+        </w:rPr>
+        <w:t xml:space="preserve">T1002,2026-08-10 13:33,S155,Coffee,3,120</w:t>
+      </w:r>
+      <w:r>
+        <w:br/>
+      </w:r>
+      <w:r>
+        <w:rPr>
+          <w:rStyle w:val="VerbatimChar"/>
+        </w:rPr>
+        <w:t xml:space="preserve">... (594 more lines)</w:t>
+      </w:r>
+    </w:p>
+    <w:p>
+      <w:pPr>
+        <w:pStyle w:val="FirstParagraph"/>
+      </w:pPr>
+      <w:r>
+        <w:rPr>
+          <w:bCs/>
+          <w:b/>
+        </w:rPr>
+        <w:t xml:space="preserve">Job 3: Mapper output (key TAB value)</w:t>
+      </w:r>
+      <w:r>
+        <w:t xml:space="preserve"> </w:t>
+      </w:r>
+      <w:r>
+        <w:t xml:space="preserve">(594 lines)</w:t>
+      </w:r>
+    </w:p>
+    <w:p>
+      <w:pPr>
+        <w:pStyle w:val="SourceCode"/>
+      </w:pPr>
+      <w:r>
+        <w:rPr>
+          <w:rStyle w:val="VerbatimChar"/>
+        </w:rPr>
+        <w:t xml:space="preserve">$ python src/job3_canteen_mapper.py &lt; data/canteen.csv</w:t>
+      </w:r>
+      <w:r>
+        <w:br/>
+      </w:r>
+      <w:r>
+        <w:rPr>
+          <w:rStyle w:val="VerbatimChar"/>
+        </w:rPr>
+        <w:t xml:space="preserve">Juice    1,50.0</w:t>
+      </w:r>
+      <w:r>
+        <w:br/>
+      </w:r>
+      <w:r>
+        <w:rPr>
+          <w:rStyle w:val="VerbatimChar"/>
+        </w:rPr>
+        <w:t xml:space="preserve">Coffee    3,120.0</w:t>
+      </w:r>
+      <w:r>
+        <w:br/>
+      </w:r>
+      <w:r>
+        <w:rPr>
+          <w:rStyle w:val="VerbatimChar"/>
+        </w:rPr>
+        <w:t xml:space="preserve">Muffin    1,45.0</w:t>
+      </w:r>
+      <w:r>
+        <w:br/>
+      </w:r>
+      <w:r>
+        <w:rPr>
+          <w:rStyle w:val="VerbatimChar"/>
+        </w:rPr>
+        <w:t xml:space="preserve">... (591 more lines)</w:t>
+      </w:r>
+    </w:p>
+    <w:p>
+      <w:pPr>
+        <w:pStyle w:val="FirstParagraph"/>
+      </w:pPr>
+      <w:r>
+        <w:t xml:space="preserve">Malformed records rejected by the mapper:</w:t>
+      </w:r>
+      <w:r>
+        <w:t xml:space="preserve"> </w:t>
+      </w:r>
+      <w:r>
+        <w:rPr>
+          <w:bCs/>
+          <w:b/>
+        </w:rPr>
+        <w:t xml:space="preserve">2</w:t>
+      </w:r>
+    </w:p>
+    <w:p>
+      <w:pPr>
+        <w:pStyle w:val="BodyText"/>
+      </w:pPr>
+      <w:r>
+        <w:rPr>
+          <w:bCs/>
+          <w:b/>
+        </w:rPr>
+        <w:t xml:space="preserve">Job 3: after Shuffle &amp; Sort (grouped by key)</w:t>
+      </w:r>
+      <w:r>
+        <w:t xml:space="preserve"> </w:t>
+      </w:r>
+      <w:r>
+        <w:t xml:space="preserve">(594 lines)</w:t>
+      </w:r>
+    </w:p>
+    <w:p>
+      <w:pPr>
+        <w:pStyle w:val="SourceCode"/>
+      </w:pPr>
+      <w:r>
+        <w:rPr>
+          <w:rStyle w:val="VerbatimChar"/>
+        </w:rPr>
+        <w:t xml:space="preserve">$ ... | sort</w:t>
+      </w:r>
+      <w:r>
+        <w:br/>
+      </w:r>
+      <w:r>
+        <w:rPr>
+          <w:rStyle w:val="VerbatimChar"/>
+        </w:rPr>
+        <w:t xml:space="preserve">Burger    1,120.0</w:t>
+      </w:r>
+      <w:r>
+        <w:br/>
+      </w:r>
+      <w:r>
+        <w:rPr>
+          <w:rStyle w:val="VerbatimChar"/>
+        </w:rPr>
+        <w:t xml:space="preserve">Burger    1,120.0</w:t>
+      </w:r>
+      <w:r>
+        <w:br/>
+      </w:r>
+      <w:r>
+        <w:rPr>
+          <w:rStyle w:val="VerbatimChar"/>
+        </w:rPr>
+        <w:t xml:space="preserve">Burger    1,120.0</w:t>
+      </w:r>
+      <w:r>
+        <w:br/>
+      </w:r>
+      <w:r>
+        <w:rPr>
+          <w:rStyle w:val="VerbatimChar"/>
+        </w:rPr>
+        <w:t xml:space="preserve">... (591 more lines)</w:t>
+      </w:r>
+    </w:p>
+    <w:p>
+      <w:pPr>
+        <w:pStyle w:val="FirstParagraph"/>
+      </w:pPr>
+      <w:r>
+        <w:rPr>
+          <w:bCs/>
+          <w:b/>
+        </w:rPr>
+        <w:t xml:space="preserve">Job 3: after Combiner (one partial sum per key)</w:t>
+      </w:r>
+      <w:r>
+        <w:t xml:space="preserve"> </w:t>
+      </w:r>
+      <w:r>
+        <w:t xml:space="preserve">(10 lines)</w:t>
+      </w:r>
+    </w:p>
+    <w:p>
+      <w:pPr>
+        <w:pStyle w:val="SourceCode"/>
+      </w:pPr>
+      <w:r>
+        <w:rPr>
+          <w:rStyle w:val="VerbatimChar"/>
+        </w:rPr>
+        <w:t xml:space="preserve">$ ... | sort | python src/job1_wifi_combiner.py</w:t>
+      </w:r>
+      <w:r>
+        <w:br/>
+      </w:r>
+      <w:r>
+        <w:rPr>
+          <w:rStyle w:val="VerbatimChar"/>
+        </w:rPr>
+        <w:t xml:space="preserve">Burger    92,11040</w:t>
+      </w:r>
+      <w:r>
+        <w:br/>
+      </w:r>
+      <w:r>
+        <w:rPr>
+          <w:rStyle w:val="VerbatimChar"/>
+        </w:rPr>
+        <w:t xml:space="preserve">Coffee    112,4480</w:t>
+      </w:r>
+      <w:r>
+        <w:br/>
+      </w:r>
+      <w:r>
+        <w:rPr>
+          <w:rStyle w:val="VerbatimChar"/>
+        </w:rPr>
+        <w:t xml:space="preserve">Juice    120,6000</w:t>
+      </w:r>
+      <w:r>
+        <w:br/>
+      </w:r>
+      <w:r>
+        <w:rPr>
+          <w:rStyle w:val="VerbatimChar"/>
+        </w:rPr>
+        <w:t xml:space="preserve">... (7 more lines)</w:t>
+      </w:r>
+    </w:p>
+    <w:p>
+      <w:pPr>
+        <w:pStyle w:val="FirstParagraph"/>
+      </w:pPr>
+      <w:r>
+        <w:rPr>
+          <w:bCs/>
+          <w:b/>
+        </w:rPr>
+        <w:t xml:space="preserve">Job 3: Reducer output</w:t>
+      </w:r>
+      <w:r>
+        <w:t xml:space="preserve"> </w:t>
+      </w:r>
+      <w:r>
+        <w:t xml:space="preserve">(10 lines)</w:t>
+      </w:r>
+    </w:p>
+    <w:p>
+      <w:pPr>
+        <w:pStyle w:val="SourceCode"/>
+      </w:pPr>
+      <w:r>
+        <w:rPr>
+          <w:rStyle w:val="VerbatimChar"/>
+        </w:rPr>
+        <w:t xml:space="preserve">$ ... | sort | python src/job3_canteen_reducer.py</w:t>
+      </w:r>
+      <w:r>
+        <w:br/>
+      </w:r>
+      <w:r>
+        <w:rPr>
+          <w:rStyle w:val="VerbatimChar"/>
+        </w:rPr>
+        <w:t xml:space="preserve">Burger    TotalQuantity=92,TotalRevenue=11040.00</w:t>
+      </w:r>
+      <w:r>
+        <w:br/>
+      </w:r>
+      <w:r>
+        <w:rPr>
+          <w:rStyle w:val="VerbatimChar"/>
+        </w:rPr>
+        <w:t xml:space="preserve">Coffee    TotalQuantity=112,TotalRevenue=4480.00</w:t>
+      </w:r>
+      <w:r>
+        <w:br/>
+      </w:r>
+      <w:r>
+        <w:rPr>
+          <w:rStyle w:val="VerbatimChar"/>
+        </w:rPr>
+        <w:t xml:space="preserve">Juice    TotalQuantity=120,TotalRevenue=6000.00</w:t>
+      </w:r>
+      <w:r>
+        <w:br/>
+      </w:r>
+      <w:r>
+        <w:rPr>
+          <w:rStyle w:val="VerbatimChar"/>
+        </w:rPr>
+        <w:t xml:space="preserve">Muffin    TotalQuantity=83,TotalRevenue=3735.00</w:t>
+      </w:r>
+      <w:r>
+        <w:br/>
+      </w:r>
+      <w:r>
+        <w:rPr>
+          <w:rStyle w:val="VerbatimChar"/>
+        </w:rPr>
+        <w:t xml:space="preserve">Noodles    TotalQuantity=58,TotalRevenue=6380.00</w:t>
+      </w:r>
+      <w:r>
+        <w:br/>
+      </w:r>
+      <w:r>
+        <w:rPr>
+          <w:rStyle w:val="VerbatimChar"/>
+        </w:rPr>
+        <w:t xml:space="preserve">Pasta    TotalQuantity=68,TotalRevenue=9520.00</w:t>
+      </w:r>
+      <w:r>
+        <w:br/>
+      </w:r>
+      <w:r>
+        <w:rPr>
+          <w:rStyle w:val="VerbatimChar"/>
+        </w:rPr>
+        <w:t xml:space="preserve">Samosa    TotalQuantity=64,TotalRevenue=960.00</w:t>
+      </w:r>
+      <w:r>
+        <w:br/>
+      </w:r>
+      <w:r>
+        <w:rPr>
+          <w:rStyle w:val="VerbatimChar"/>
+        </w:rPr>
+        <w:t xml:space="preserve">Sandwich    TotalQuantity=97,TotalRevenue=7760.00</w:t>
+      </w:r>
+      <w:r>
+        <w:br/>
+      </w:r>
+      <w:r>
+        <w:rPr>
+          <w:rStyle w:val="VerbatimChar"/>
+        </w:rPr>
+        <w:t xml:space="preserve">Tea    TotalQuantity=74,TotalRevenue=1480.00</w:t>
+      </w:r>
+      <w:r>
+        <w:br/>
+      </w:r>
+      <w:r>
+        <w:rPr>
+          <w:rStyle w:val="VerbatimChar"/>
+        </w:rPr>
+        <w:t xml:space="preserve">Water    TotalQuantity=67,TotalRevenue=1340.00</w:t>
+      </w:r>
+    </w:p>
+    <w:p>
+      <w:pPr>
+        <w:pStyle w:val="FirstParagraph"/>
+      </w:pPr>
+      <w:r>
+        <w:rPr>
+          <w:bCs/>
+          <w:b/>
+        </w:rPr>
+        <w:t xml:space="preserve">Answer: highest revenue item</w:t>
+      </w:r>
+      <w:r>
+        <w:t xml:space="preserve"> </w:t>
+      </w:r>
+      <w:r>
+        <w:t xml:space="preserve">(1 line)</w:t>
+      </w:r>
+    </w:p>
+    <w:p>
+      <w:pPr>
+        <w:pStyle w:val="SourceCode"/>
+      </w:pPr>
+      <w:r>
+        <w:rPr>
+          <w:rStyle w:val="VerbatimChar"/>
+        </w:rPr>
+        <w:t xml:space="preserve">Burger    TotalQuantity=92,TotalRevenue=11040.00</w:t>
+      </w:r>
+    </w:p>
+    <w:p>
+      <w:pPr>
+        <w:pStyle w:val="FirstParagraph"/>
+      </w:pPr>
+      <w:r>
+        <w:rPr>
+          <w:bCs/>
+          <w:b/>
+        </w:rPr>
+        <w:t xml:space="preserve">Answer: highest quantity item</w:t>
+      </w:r>
+      <w:r>
+        <w:t xml:space="preserve"> </w:t>
+      </w:r>
+      <w:r>
+        <w:t xml:space="preserve">(1 line)</w:t>
+      </w:r>
+    </w:p>
+    <w:p>
+      <w:pPr>
+        <w:pStyle w:val="SourceCode"/>
+      </w:pPr>
+      <w:r>
+        <w:rPr>
+          <w:rStyle w:val="VerbatimChar"/>
+        </w:rPr>
+        <w:t xml:space="preserve">Juice    TotalQuantity=120,TotalRevenue=6000.00</w:t>
+      </w:r>
+    </w:p>
+    <w:bookmarkEnd w:id="40"/>
+    <w:bookmarkStart w:id="41" w:name="job-4-top-co-purchased-items-2-stages"/>
+    <w:p>
+      <w:pPr>
+        <w:pStyle w:val="Heading2"/>
+      </w:pPr>
+      <w:r>
+        <w:t xml:space="preserve">Job 4: Top Co-Purchased Items (2 stages)</w:t>
+      </w:r>
+    </w:p>
+    <w:p>
+      <w:pPr>
+        <w:pStyle w:val="FirstParagraph"/>
+      </w:pPr>
+      <w:r>
+        <w:rPr>
+          <w:bCs/>
+          <w:b/>
+        </w:rPr>
+        <w:t xml:space="preserve">Job 4 Stage 1: input (data/canteen.csv)</w:t>
+      </w:r>
+      <w:r>
+        <w:t xml:space="preserve"> </w:t>
+      </w:r>
+      <w:r>
+        <w:t xml:space="preserve">(597 lines)</w:t>
+      </w:r>
+    </w:p>
+    <w:p>
+      <w:pPr>
+        <w:pStyle w:val="SourceCode"/>
+      </w:pPr>
+      <w:r>
+        <w:rPr>
+          <w:rStyle w:val="VerbatimChar"/>
+        </w:rPr>
+        <w:t xml:space="preserve">$ head data/canteen.csv</w:t>
+      </w:r>
+      <w:r>
+        <w:br/>
+      </w:r>
+      <w:r>
+        <w:rPr>
+          <w:rStyle w:val="VerbatimChar"/>
+        </w:rPr>
+        <w:t xml:space="preserve">TransactionID,Timestamp,StudentID,Item,Quantity,Amount</w:t>
+      </w:r>
+      <w:r>
+        <w:br/>
+      </w:r>
+      <w:r>
+        <w:rPr>
+          <w:rStyle w:val="VerbatimChar"/>
+        </w:rPr>
+        <w:t xml:space="preserve">T1001,2026-08-10 13:35,S149,Juice,1,50</w:t>
+      </w:r>
+      <w:r>
+        <w:br/>
+      </w:r>
+      <w:r>
+        <w:rPr>
+          <w:rStyle w:val="VerbatimChar"/>
+        </w:rPr>
+        <w:t xml:space="preserve">T1002,2026-08-10 13:33,S155,Coffee,3,120</w:t>
+      </w:r>
+      <w:r>
+        <w:br/>
+      </w:r>
+      <w:r>
+        <w:rPr>
+          <w:rStyle w:val="VerbatimChar"/>
+        </w:rPr>
+        <w:t xml:space="preserve">... (594 more lines)</w:t>
+      </w:r>
+    </w:p>
+    <w:p>
+      <w:pPr>
+        <w:pStyle w:val="FirstParagraph"/>
+      </w:pPr>
+      <w:r>
+        <w:rPr>
+          <w:bCs/>
+          <w:b/>
+        </w:rPr>
+        <w:t xml:space="preserve">Job 4 Stage 1: Mapper output (key TAB value)</w:t>
+      </w:r>
+      <w:r>
+        <w:t xml:space="preserve"> </w:t>
+      </w:r>
+      <w:r>
+        <w:t xml:space="preserve">(595 lines)</w:t>
+      </w:r>
+    </w:p>
+    <w:p>
+      <w:pPr>
+        <w:pStyle w:val="SourceCode"/>
+      </w:pPr>
+      <w:r>
+        <w:rPr>
+          <w:rStyle w:val="VerbatimChar"/>
+        </w:rPr>
+        <w:t xml:space="preserve">$ python src/job4_stage1_mapper.py &lt; data/canteen.csv</w:t>
+      </w:r>
+      <w:r>
+        <w:br/>
+      </w:r>
+      <w:r>
+        <w:rPr>
+          <w:rStyle w:val="VerbatimChar"/>
+        </w:rPr>
+        <w:t xml:space="preserve">T1001    Juice</w:t>
+      </w:r>
+      <w:r>
+        <w:br/>
+      </w:r>
+      <w:r>
+        <w:rPr>
+          <w:rStyle w:val="VerbatimChar"/>
+        </w:rPr>
+        <w:t xml:space="preserve">T1002    Coffee</w:t>
+      </w:r>
+      <w:r>
+        <w:br/>
+      </w:r>
+      <w:r>
+        <w:rPr>
+          <w:rStyle w:val="VerbatimChar"/>
+        </w:rPr>
+        <w:t xml:space="preserve">T1002    Muffin</w:t>
+      </w:r>
+      <w:r>
+        <w:br/>
+      </w:r>
+      <w:r>
+        <w:rPr>
+          <w:rStyle w:val="VerbatimChar"/>
+        </w:rPr>
+        <w:t xml:space="preserve">... (592 more lines)</w:t>
+      </w:r>
+    </w:p>
+    <w:p>
+      <w:pPr>
+        <w:pStyle w:val="FirstParagraph"/>
+      </w:pPr>
+      <w:r>
+        <w:t xml:space="preserve">Malformed records rejected by the mapper:</w:t>
+      </w:r>
+      <w:r>
+        <w:t xml:space="preserve"> </w:t>
+      </w:r>
+      <w:r>
+        <w:rPr>
+          <w:bCs/>
+          <w:b/>
+        </w:rPr>
+        <w:t xml:space="preserve">1</w:t>
+      </w:r>
+    </w:p>
+    <w:p>
+      <w:pPr>
+        <w:pStyle w:val="BodyText"/>
+      </w:pPr>
+      <w:r>
+        <w:rPr>
+          <w:bCs/>
+          <w:b/>
+        </w:rPr>
+        <w:t xml:space="preserve">Job 4 Stage 1: after Shuffle &amp; Sort (grouped by key)</w:t>
+      </w:r>
+      <w:r>
+        <w:t xml:space="preserve"> </w:t>
+      </w:r>
+      <w:r>
+        <w:t xml:space="preserve">(595 lines)</w:t>
+      </w:r>
+    </w:p>
+    <w:p>
+      <w:pPr>
+        <w:pStyle w:val="SourceCode"/>
+      </w:pPr>
+      <w:r>
+        <w:rPr>
+          <w:rStyle w:val="VerbatimChar"/>
+        </w:rPr>
+        <w:t xml:space="preserve">$ ... | sort</w:t>
+      </w:r>
+      <w:r>
+        <w:br/>
+      </w:r>
+      <w:r>
+        <w:rPr>
+          <w:rStyle w:val="VerbatimChar"/>
+        </w:rPr>
+        <w:t xml:space="preserve">T1001    Juice</w:t>
+      </w:r>
+      <w:r>
+        <w:br/>
+      </w:r>
+      <w:r>
+        <w:rPr>
+          <w:rStyle w:val="VerbatimChar"/>
+        </w:rPr>
+        <w:t xml:space="preserve">T1002    Coffee</w:t>
+      </w:r>
+      <w:r>
+        <w:br/>
+      </w:r>
+      <w:r>
+        <w:rPr>
+          <w:rStyle w:val="VerbatimChar"/>
+        </w:rPr>
+        <w:t xml:space="preserve">T1002    Muffin</w:t>
+      </w:r>
+      <w:r>
+        <w:br/>
+      </w:r>
+      <w:r>
+        <w:rPr>
+          <w:rStyle w:val="VerbatimChar"/>
+        </w:rPr>
+        <w:t xml:space="preserve">... (592 more lines)</w:t>
+      </w:r>
+    </w:p>
+    <w:p>
+      <w:pPr>
+        <w:pStyle w:val="FirstParagraph"/>
+      </w:pPr>
+      <w:r>
+        <w:rPr>
+          <w:bCs/>
+          <w:b/>
+        </w:rPr>
+        <w:t xml:space="preserve">Job 4 Stage 1: Reducer output</w:t>
+      </w:r>
+      <w:r>
+        <w:t xml:space="preserve"> </w:t>
+      </w:r>
+      <w:r>
+        <w:t xml:space="preserve">(392 lines)</w:t>
+      </w:r>
+    </w:p>
+    <w:p>
+      <w:pPr>
+        <w:pStyle w:val="SourceCode"/>
+      </w:pPr>
+      <w:r>
+        <w:rPr>
+          <w:rStyle w:val="VerbatimChar"/>
+        </w:rPr>
+        <w:t xml:space="preserve">$ ... | sort | python src/job4_stage1_reducer.py</w:t>
+      </w:r>
+      <w:r>
+        <w:br/>
+      </w:r>
+      <w:r>
+        <w:rPr>
+          <w:rStyle w:val="VerbatimChar"/>
+        </w:rPr>
+        <w:t xml:space="preserve">Coffee|Muffin    1</w:t>
+      </w:r>
+      <w:r>
+        <w:br/>
+      </w:r>
+      <w:r>
+        <w:rPr>
+          <w:rStyle w:val="VerbatimChar"/>
+        </w:rPr>
+        <w:t xml:space="preserve">Burger|Coffee    1</w:t>
+      </w:r>
+      <w:r>
+        <w:br/>
+      </w:r>
+      <w:r>
+        <w:rPr>
+          <w:rStyle w:val="VerbatimChar"/>
+        </w:rPr>
+        <w:t xml:space="preserve">Burger|Juice    1</w:t>
+      </w:r>
+      <w:r>
+        <w:br/>
+      </w:r>
+      <w:r>
+        <w:rPr>
+          <w:rStyle w:val="VerbatimChar"/>
+        </w:rPr>
+        <w:t xml:space="preserve">... (389 more lines)</w:t>
+      </w:r>
+    </w:p>
+    <w:p>
+      <w:pPr>
+        <w:pStyle w:val="FirstParagraph"/>
+      </w:pPr>
+      <w:r>
+        <w:rPr>
+          <w:bCs/>
+          <w:b/>
+        </w:rPr>
+        <w:t xml:space="preserve">Job 4 Stage 2: input (output/job4_stage1_pairs.txt)</w:t>
+      </w:r>
+      <w:r>
+        <w:t xml:space="preserve"> </w:t>
+      </w:r>
+      <w:r>
+        <w:t xml:space="preserve">(392 lines)</w:t>
+      </w:r>
+    </w:p>
+    <w:p>
+      <w:pPr>
+        <w:pStyle w:val="SourceCode"/>
+      </w:pPr>
+      <w:r>
+        <w:rPr>
+          <w:rStyle w:val="VerbatimChar"/>
+        </w:rPr>
+        <w:t xml:space="preserve">$ head output/job4_stage1_pairs.txt</w:t>
+      </w:r>
+      <w:r>
+        <w:br/>
+      </w:r>
+      <w:r>
+        <w:rPr>
+          <w:rStyle w:val="VerbatimChar"/>
+        </w:rPr>
+        <w:t xml:space="preserve">Coffee|Muffin    1</w:t>
+      </w:r>
+      <w:r>
+        <w:br/>
+      </w:r>
+      <w:r>
+        <w:rPr>
+          <w:rStyle w:val="VerbatimChar"/>
+        </w:rPr>
+        <w:t xml:space="preserve">Burger|Coffee    1</w:t>
+      </w:r>
+      <w:r>
+        <w:br/>
+      </w:r>
+      <w:r>
+        <w:rPr>
+          <w:rStyle w:val="VerbatimChar"/>
+        </w:rPr>
+        <w:t xml:space="preserve">Burger|Juice    1</w:t>
+      </w:r>
+      <w:r>
+        <w:br/>
+      </w:r>
+      <w:r>
+        <w:rPr>
+          <w:rStyle w:val="VerbatimChar"/>
+        </w:rPr>
+        <w:t xml:space="preserve">... (389 more lines)</w:t>
+      </w:r>
+    </w:p>
+    <w:p>
+      <w:pPr>
+        <w:pStyle w:val="FirstParagraph"/>
+      </w:pPr>
+      <w:r>
+        <w:rPr>
+          <w:bCs/>
+          <w:b/>
+        </w:rPr>
+        <w:t xml:space="preserve">Job 4 Stage 2: Mapper output (key TAB value)</w:t>
+      </w:r>
+      <w:r>
+        <w:t xml:space="preserve"> </w:t>
+      </w:r>
+      <w:r>
+        <w:t xml:space="preserve">(392 lines)</w:t>
+      </w:r>
+    </w:p>
+    <w:p>
+      <w:pPr>
+        <w:pStyle w:val="SourceCode"/>
+      </w:pPr>
+      <w:r>
+        <w:rPr>
+          <w:rStyle w:val="VerbatimChar"/>
+        </w:rPr>
+        <w:t xml:space="preserve">$ python src/job4_stage2_mapper.py &lt; output/job4_stage1_pairs.txt</w:t>
+      </w:r>
+      <w:r>
+        <w:br/>
+      </w:r>
+      <w:r>
+        <w:rPr>
+          <w:rStyle w:val="VerbatimChar"/>
+        </w:rPr>
+        <w:t xml:space="preserve">Coffee|Muffin    1</w:t>
+      </w:r>
+      <w:r>
+        <w:br/>
+      </w:r>
+      <w:r>
+        <w:rPr>
+          <w:rStyle w:val="VerbatimChar"/>
+        </w:rPr>
+        <w:t xml:space="preserve">Burger|Coffee    1</w:t>
+      </w:r>
+      <w:r>
+        <w:br/>
+      </w:r>
+      <w:r>
+        <w:rPr>
+          <w:rStyle w:val="VerbatimChar"/>
+        </w:rPr>
+        <w:t xml:space="preserve">Burger|Juice    1</w:t>
+      </w:r>
+      <w:r>
+        <w:br/>
+      </w:r>
+      <w:r>
+        <w:rPr>
+          <w:rStyle w:val="VerbatimChar"/>
+        </w:rPr>
+        <w:t xml:space="preserve">... (389 more lines)</w:t>
+      </w:r>
+    </w:p>
+    <w:p>
+      <w:pPr>
+        <w:pStyle w:val="FirstParagraph"/>
+      </w:pPr>
+      <w:r>
+        <w:rPr>
+          <w:bCs/>
+          <w:b/>
+        </w:rPr>
+        <w:t xml:space="preserve">Job 4 Stage 2: after Shuffle &amp; Sort (grouped by key)</w:t>
+      </w:r>
+      <w:r>
+        <w:t xml:space="preserve"> </w:t>
+      </w:r>
+      <w:r>
+        <w:t xml:space="preserve">(392 lines)</w:t>
+      </w:r>
+    </w:p>
+    <w:p>
+      <w:pPr>
+        <w:pStyle w:val="SourceCode"/>
+      </w:pPr>
+      <w:r>
+        <w:rPr>
+          <w:rStyle w:val="VerbatimChar"/>
+        </w:rPr>
+        <w:t xml:space="preserve">$ ... | sort</w:t>
+      </w:r>
+      <w:r>
+        <w:br/>
+      </w:r>
+      <w:r>
+        <w:rPr>
+          <w:rStyle w:val="VerbatimChar"/>
+        </w:rPr>
+        <w:t xml:space="preserve">Burger|Coffee    1</w:t>
+      </w:r>
+      <w:r>
+        <w:br/>
+      </w:r>
+      <w:r>
+        <w:rPr>
+          <w:rStyle w:val="VerbatimChar"/>
+        </w:rPr>
+        <w:t xml:space="preserve">Burger|Coffee    1</w:t>
+      </w:r>
+      <w:r>
+        <w:br/>
+      </w:r>
+      <w:r>
+        <w:rPr>
+          <w:rStyle w:val="VerbatimChar"/>
+        </w:rPr>
+        <w:t xml:space="preserve">Burger|Coffee    1</w:t>
+      </w:r>
+      <w:r>
+        <w:br/>
+      </w:r>
+      <w:r>
+        <w:rPr>
+          <w:rStyle w:val="VerbatimChar"/>
+        </w:rPr>
+        <w:t xml:space="preserve">... (389 more lines)</w:t>
+      </w:r>
+    </w:p>
+    <w:p>
+      <w:pPr>
+        <w:pStyle w:val="FirstParagraph"/>
+      </w:pPr>
+      <w:r>
+        <w:rPr>
+          <w:bCs/>
+          <w:b/>
+        </w:rPr>
+        <w:t xml:space="preserve">Job 4 Stage 2: after Combiner (one partial sum per key)</w:t>
+      </w:r>
+      <w:r>
+        <w:t xml:space="preserve"> </w:t>
+      </w:r>
+      <w:r>
+        <w:t xml:space="preserve">(45 lines)</w:t>
+      </w:r>
+    </w:p>
+    <w:p>
+      <w:pPr>
+        <w:pStyle w:val="SourceCode"/>
+      </w:pPr>
+      <w:r>
+        <w:rPr>
+          <w:rStyle w:val="VerbatimChar"/>
+        </w:rPr>
+        <w:t xml:space="preserve">$ ... | sort | python src/job1_wifi_combiner.py</w:t>
+      </w:r>
+      <w:r>
+        <w:br/>
+      </w:r>
+      <w:r>
+        <w:rPr>
+          <w:rStyle w:val="VerbatimChar"/>
+        </w:rPr>
+        <w:t xml:space="preserve">Burger|Coffee    6</w:t>
+      </w:r>
+      <w:r>
+        <w:br/>
+      </w:r>
+      <w:r>
+        <w:rPr>
+          <w:rStyle w:val="VerbatimChar"/>
+        </w:rPr>
+        <w:t xml:space="preserve">Burger|Juice    42</w:t>
+      </w:r>
+      <w:r>
+        <w:br/>
+      </w:r>
+      <w:r>
+        <w:rPr>
+          <w:rStyle w:val="VerbatimChar"/>
+        </w:rPr>
+        <w:t xml:space="preserve">Burger|Muffin    5</w:t>
+      </w:r>
+      <w:r>
+        <w:br/>
+      </w:r>
+      <w:r>
+        <w:rPr>
+          <w:rStyle w:val="VerbatimChar"/>
+        </w:rPr>
+        <w:t xml:space="preserve">... (42 more lines)</w:t>
+      </w:r>
+    </w:p>
+    <w:p>
+      <w:pPr>
+        <w:pStyle w:val="FirstParagraph"/>
+      </w:pPr>
+      <w:r>
+        <w:rPr>
+          <w:bCs/>
+          <w:b/>
+        </w:rPr>
+        <w:t xml:space="preserve">Job 4 Stage 2: Reducer output</w:t>
+      </w:r>
+      <w:r>
+        <w:t xml:space="preserve"> </w:t>
+      </w:r>
+      <w:r>
+        <w:t xml:space="preserve">(45 lines)</w:t>
+      </w:r>
+    </w:p>
+    <w:p>
+      <w:pPr>
+        <w:pStyle w:val="SourceCode"/>
+      </w:pPr>
+      <w:r>
+        <w:rPr>
+          <w:rStyle w:val="VerbatimChar"/>
+        </w:rPr>
+        <w:t xml:space="preserve">$ ... | sort | python src/job4_stage2_reducer.py</w:t>
+      </w:r>
+      <w:r>
+        <w:br/>
+      </w:r>
+      <w:r>
+        <w:rPr>
+          <w:rStyle w:val="VerbatimChar"/>
+        </w:rPr>
+        <w:t xml:space="preserve">Burger|Coffee    Transactions=6</w:t>
+      </w:r>
+      <w:r>
+        <w:br/>
+      </w:r>
+      <w:r>
+        <w:rPr>
+          <w:rStyle w:val="VerbatimChar"/>
+        </w:rPr>
+        <w:t xml:space="preserve">Burger|Juice    Transactions=42</w:t>
+      </w:r>
+      <w:r>
+        <w:br/>
+      </w:r>
+      <w:r>
+        <w:rPr>
+          <w:rStyle w:val="VerbatimChar"/>
+        </w:rPr>
+        <w:t xml:space="preserve">Burger|Muffin    Transactions=5</w:t>
+      </w:r>
+      <w:r>
+        <w:br/>
+      </w:r>
+      <w:r>
+        <w:rPr>
+          <w:rStyle w:val="VerbatimChar"/>
+        </w:rPr>
+        <w:t xml:space="preserve">... (42 more lines)</w:t>
+      </w:r>
+    </w:p>
+    <w:p>
+      <w:pPr>
+        <w:pStyle w:val="FirstParagraph"/>
+      </w:pPr>
+      <w:r>
+        <w:rPr>
+          <w:bCs/>
+          <w:b/>
+        </w:rPr>
+        <w:t xml:space="preserve">Answer: top 5 pairs by number of transactions</w:t>
+      </w:r>
+      <w:r>
+        <w:t xml:space="preserve"> </w:t>
+      </w:r>
+      <w:r>
+        <w:t xml:space="preserve">(5 lines)</w:t>
+      </w:r>
+    </w:p>
+    <w:p>
+      <w:pPr>
+        <w:pStyle w:val="SourceCode"/>
+      </w:pPr>
+      <w:r>
+        <w:rPr>
+          <w:rStyle w:val="VerbatimChar"/>
+        </w:rPr>
+        <w:t xml:space="preserve">Burger|Juice    Transactions=42</w:t>
+      </w:r>
+      <w:r>
+        <w:br/>
+      </w:r>
+      <w:r>
+        <w:rPr>
+          <w:rStyle w:val="VerbatimChar"/>
+        </w:rPr>
+        <w:t xml:space="preserve">Coffee|Sandwich    Transactions=36</w:t>
+      </w:r>
+      <w:r>
+        <w:br/>
+      </w:r>
+      <w:r>
+        <w:rPr>
+          <w:rStyle w:val="VerbatimChar"/>
+        </w:rPr>
+        <w:t xml:space="preserve">Juice|Pasta    Transactions=33</w:t>
+      </w:r>
+      <w:r>
+        <w:br/>
+      </w:r>
+      <w:r>
+        <w:rPr>
+          <w:rStyle w:val="VerbatimChar"/>
+        </w:rPr>
+        <w:t xml:space="preserve">Samosa|Tea    Transactions=31</w:t>
+      </w:r>
+      <w:r>
+        <w:br/>
+      </w:r>
+      <w:r>
+        <w:rPr>
+          <w:rStyle w:val="VerbatimChar"/>
+        </w:rPr>
+        <w:t xml:space="preserve">Coffee|Muffin    Transactions=28</w:t>
+      </w:r>
+    </w:p>
+    <w:bookmarkEnd w:id="41"/>
+    <w:bookmarkStart w:id="42" w:name="job-5-library-usage-anomaly-3-stages"/>
+    <w:p>
+      <w:pPr>
+        <w:pStyle w:val="Heading2"/>
+      </w:pPr>
+      <w:r>
+        <w:t xml:space="preserve">Job 5: Library Usage Anomaly (3 stages)</w:t>
+      </w:r>
+    </w:p>
+    <w:p>
+      <w:pPr>
+        <w:pStyle w:val="FirstParagraph"/>
+      </w:pPr>
+      <w:r>
+        <w:rPr>
+          <w:bCs/>
+          <w:b/>
+        </w:rPr>
+        <w:t xml:space="preserve">Job 5 Stage 1: input (data/library.csv)</w:t>
+      </w:r>
+      <w:r>
+        <w:t xml:space="preserve"> </w:t>
+      </w:r>
+      <w:r>
+        <w:t xml:space="preserve">(323 lines)</w:t>
+      </w:r>
+    </w:p>
+    <w:p>
+      <w:pPr>
+        <w:pStyle w:val="SourceCode"/>
+      </w:pPr>
+      <w:r>
+        <w:rPr>
+          <w:rStyle w:val="VerbatimChar"/>
+        </w:rPr>
+        <w:t xml:space="preserve">$ head data/library.csv</w:t>
+      </w:r>
+      <w:r>
+        <w:br/>
+      </w:r>
+      <w:r>
+        <w:rPr>
+          <w:rStyle w:val="VerbatimChar"/>
+        </w:rPr>
+        <w:t xml:space="preserve">StudentID,Timestamp,EntryType,DurationMin</w:t>
+      </w:r>
+      <w:r>
+        <w:br/>
+      </w:r>
+      <w:r>
+        <w:rPr>
+          <w:rStyle w:val="VerbatimChar"/>
+        </w:rPr>
+        <w:t xml:space="preserve">S142,2026-08-10 08:09,ENTRY,109</w:t>
+      </w:r>
+      <w:r>
+        <w:br/>
+      </w:r>
+      <w:r>
+        <w:rPr>
+          <w:rStyle w:val="VerbatimChar"/>
+        </w:rPr>
+        <w:t xml:space="preserve">S135,2026-08-10 08:10,ENTRY,40</w:t>
+      </w:r>
+      <w:r>
+        <w:br/>
+      </w:r>
+      <w:r>
+        <w:rPr>
+          <w:rStyle w:val="VerbatimChar"/>
+        </w:rPr>
+        <w:t xml:space="preserve">... (320 more lines)</w:t>
+      </w:r>
+    </w:p>
+    <w:p>
+      <w:pPr>
+        <w:pStyle w:val="FirstParagraph"/>
+      </w:pPr>
+      <w:r>
+        <w:rPr>
+          <w:bCs/>
+          <w:b/>
+        </w:rPr>
+        <w:t xml:space="preserve">Job 5 Stage 1: Mapper output (key TAB value)</w:t>
+      </w:r>
+      <w:r>
+        <w:t xml:space="preserve"> </w:t>
+      </w:r>
+      <w:r>
+        <w:t xml:space="preserve">(160 lines)</w:t>
+      </w:r>
+    </w:p>
+    <w:p>
+      <w:pPr>
+        <w:pStyle w:val="SourceCode"/>
+      </w:pPr>
+      <w:r>
+        <w:rPr>
+          <w:rStyle w:val="VerbatimChar"/>
+        </w:rPr>
+        <w:t xml:space="preserve">$ python src/job5_stage1_mapper.py &lt; data/library.csv</w:t>
+      </w:r>
+      <w:r>
+        <w:br/>
+      </w:r>
+      <w:r>
+        <w:rPr>
+          <w:rStyle w:val="VerbatimChar"/>
+        </w:rPr>
+        <w:t xml:space="preserve">S142    109.0,1</w:t>
+      </w:r>
+      <w:r>
+        <w:br/>
+      </w:r>
+      <w:r>
+        <w:rPr>
+          <w:rStyle w:val="VerbatimChar"/>
+        </w:rPr>
+        <w:t xml:space="preserve">S135    40.0,1</w:t>
+      </w:r>
+      <w:r>
+        <w:br/>
+      </w:r>
+      <w:r>
+        <w:rPr>
+          <w:rStyle w:val="VerbatimChar"/>
+        </w:rPr>
+        <w:t xml:space="preserve">S109    66.0,1</w:t>
+      </w:r>
+      <w:r>
+        <w:br/>
+      </w:r>
+      <w:r>
+        <w:rPr>
+          <w:rStyle w:val="VerbatimChar"/>
+        </w:rPr>
+        <w:t xml:space="preserve">... (157 more lines)</w:t>
+      </w:r>
+    </w:p>
+    <w:p>
+      <w:pPr>
+        <w:pStyle w:val="FirstParagraph"/>
+      </w:pPr>
+      <w:r>
+        <w:t xml:space="preserve">Malformed records rejected by the mapper:</w:t>
+      </w:r>
+      <w:r>
+        <w:t xml:space="preserve"> </w:t>
+      </w:r>
+      <w:r>
+        <w:rPr>
+          <w:bCs/>
+          <w:b/>
+        </w:rPr>
+        <w:t xml:space="preserve">2</w:t>
+      </w:r>
+    </w:p>
+    <w:p>
+      <w:pPr>
+        <w:pStyle w:val="BodyText"/>
+      </w:pPr>
+      <w:r>
+        <w:rPr>
+          <w:bCs/>
+          <w:b/>
+        </w:rPr>
+        <w:t xml:space="preserve">Job 5 Stage 1: after Shuffle &amp; Sort (grouped by key)</w:t>
+      </w:r>
+      <w:r>
+        <w:t xml:space="preserve"> </w:t>
+      </w:r>
+      <w:r>
+        <w:t xml:space="preserve">(160 lines)</w:t>
+      </w:r>
+    </w:p>
+    <w:p>
+      <w:pPr>
+        <w:pStyle w:val="SourceCode"/>
+      </w:pPr>
+      <w:r>
+        <w:rPr>
+          <w:rStyle w:val="VerbatimChar"/>
+        </w:rPr>
+        <w:t xml:space="preserve">$ ... | sort</w:t>
+      </w:r>
+      <w:r>
+        <w:br/>
+      </w:r>
+      <w:r>
+        <w:rPr>
+          <w:rStyle w:val="VerbatimChar"/>
+        </w:rPr>
+        <w:t xml:space="preserve">S101    59.0,1</w:t>
+      </w:r>
+      <w:r>
+        <w:br/>
+      </w:r>
+      <w:r>
+        <w:rPr>
+          <w:rStyle w:val="VerbatimChar"/>
+        </w:rPr>
+        <w:t xml:space="preserve">S101    72.0,1</w:t>
+      </w:r>
+      <w:r>
+        <w:br/>
+      </w:r>
+      <w:r>
+        <w:rPr>
+          <w:rStyle w:val="VerbatimChar"/>
+        </w:rPr>
+        <w:t xml:space="preserve">S101    82.0,1</w:t>
+      </w:r>
+      <w:r>
+        <w:br/>
+      </w:r>
+      <w:r>
+        <w:rPr>
+          <w:rStyle w:val="VerbatimChar"/>
+        </w:rPr>
+        <w:t xml:space="preserve">... (157 more lines)</w:t>
+      </w:r>
+    </w:p>
+    <w:p>
+      <w:pPr>
+        <w:pStyle w:val="FirstParagraph"/>
+      </w:pPr>
+      <w:r>
+        <w:rPr>
+          <w:bCs/>
+          <w:b/>
+        </w:rPr>
+        <w:t xml:space="preserve">Job 5 Stage 1: after Combiner (one partial sum per key)</w:t>
+      </w:r>
+      <w:r>
+        <w:t xml:space="preserve"> </w:t>
+      </w:r>
+      <w:r>
+        <w:t xml:space="preserve">(58 lines)</w:t>
+      </w:r>
+    </w:p>
+    <w:p>
+      <w:pPr>
+        <w:pStyle w:val="SourceCode"/>
+      </w:pPr>
+      <w:r>
+        <w:rPr>
+          <w:rStyle w:val="VerbatimChar"/>
+        </w:rPr>
+        <w:t xml:space="preserve">$ ... | sort | python src/job1_wifi_combiner.py</w:t>
+      </w:r>
+      <w:r>
+        <w:br/>
+      </w:r>
+      <w:r>
+        <w:rPr>
+          <w:rStyle w:val="VerbatimChar"/>
+        </w:rPr>
+        <w:t xml:space="preserve">S101    306,4</w:t>
+      </w:r>
+      <w:r>
+        <w:br/>
+      </w:r>
+      <w:r>
+        <w:rPr>
+          <w:rStyle w:val="VerbatimChar"/>
+        </w:rPr>
+        <w:t xml:space="preserve">S102    96,1</w:t>
+      </w:r>
+      <w:r>
+        <w:br/>
+      </w:r>
+      <w:r>
+        <w:rPr>
+          <w:rStyle w:val="VerbatimChar"/>
+        </w:rPr>
+        <w:t xml:space="preserve">S103    92,3</w:t>
+      </w:r>
+      <w:r>
+        <w:br/>
+      </w:r>
+      <w:r>
+        <w:rPr>
+          <w:rStyle w:val="VerbatimChar"/>
+        </w:rPr>
+        <w:t xml:space="preserve">... (55 more lines)</w:t>
+      </w:r>
+    </w:p>
+    <w:p>
+      <w:pPr>
+        <w:pStyle w:val="FirstParagraph"/>
+      </w:pPr>
+      <w:r>
+        <w:rPr>
+          <w:bCs/>
+          <w:b/>
+        </w:rPr>
+        <w:t xml:space="preserve">Job 5 Stage 1: Reducer output</w:t>
+      </w:r>
+      <w:r>
+        <w:t xml:space="preserve"> </w:t>
+      </w:r>
+      <w:r>
+        <w:t xml:space="preserve">(58 lines)</w:t>
+      </w:r>
+    </w:p>
+    <w:p>
+      <w:pPr>
+        <w:pStyle w:val="SourceCode"/>
+      </w:pPr>
+      <w:r>
+        <w:rPr>
+          <w:rStyle w:val="VerbatimChar"/>
+        </w:rPr>
+        <w:t xml:space="preserve">$ ... | sort | python src/job5_stage1_reducer.py</w:t>
+      </w:r>
+      <w:r>
+        <w:br/>
+      </w:r>
+      <w:r>
+        <w:rPr>
+          <w:rStyle w:val="VerbatimChar"/>
+        </w:rPr>
+        <w:t xml:space="preserve">S101    306.00,4</w:t>
+      </w:r>
+      <w:r>
+        <w:br/>
+      </w:r>
+      <w:r>
+        <w:rPr>
+          <w:rStyle w:val="VerbatimChar"/>
+        </w:rPr>
+        <w:t xml:space="preserve">S102    96.00,1</w:t>
+      </w:r>
+      <w:r>
+        <w:br/>
+      </w:r>
+      <w:r>
+        <w:rPr>
+          <w:rStyle w:val="VerbatimChar"/>
+        </w:rPr>
+        <w:t xml:space="preserve">S103    92.00,3</w:t>
+      </w:r>
+      <w:r>
+        <w:br/>
+      </w:r>
+      <w:r>
+        <w:rPr>
+          <w:rStyle w:val="VerbatimChar"/>
+        </w:rPr>
+        <w:t xml:space="preserve">... (55 more lines)</w:t>
+      </w:r>
+    </w:p>
+    <w:p>
+      <w:pPr>
+        <w:pStyle w:val="FirstParagraph"/>
+      </w:pPr>
+      <w:r>
+        <w:rPr>
+          <w:bCs/>
+          <w:b/>
+        </w:rPr>
+        <w:t xml:space="preserve">Job 5 Stage 2 (global average): input (output/job5_stage1_students.txt)</w:t>
+      </w:r>
+      <w:r>
+        <w:t xml:space="preserve"> </w:t>
+      </w:r>
+      <w:r>
+        <w:t xml:space="preserve">(58 lines)</w:t>
+      </w:r>
+    </w:p>
+    <w:p>
+      <w:pPr>
+        <w:pStyle w:val="SourceCode"/>
+      </w:pPr>
+      <w:r>
+        <w:rPr>
+          <w:rStyle w:val="VerbatimChar"/>
+        </w:rPr>
+        <w:t xml:space="preserve">$ head output/job5_stage1_students.txt</w:t>
+      </w:r>
+      <w:r>
+        <w:br/>
+      </w:r>
+      <w:r>
+        <w:rPr>
+          <w:rStyle w:val="VerbatimChar"/>
+        </w:rPr>
+        <w:t xml:space="preserve">S101    306.00,4</w:t>
+      </w:r>
+      <w:r>
+        <w:br/>
+      </w:r>
+      <w:r>
+        <w:rPr>
+          <w:rStyle w:val="VerbatimChar"/>
+        </w:rPr>
+        <w:t xml:space="preserve">S102    96.00,1</w:t>
+      </w:r>
+      <w:r>
+        <w:br/>
+      </w:r>
+      <w:r>
+        <w:rPr>
+          <w:rStyle w:val="VerbatimChar"/>
+        </w:rPr>
+        <w:t xml:space="preserve">S103    92.00,3</w:t>
+      </w:r>
+      <w:r>
+        <w:br/>
+      </w:r>
+      <w:r>
+        <w:rPr>
+          <w:rStyle w:val="VerbatimChar"/>
+        </w:rPr>
+        <w:t xml:space="preserve">... (55 more lines)</w:t>
+      </w:r>
+    </w:p>
+    <w:p>
+      <w:pPr>
+        <w:pStyle w:val="FirstParagraph"/>
+      </w:pPr>
+      <w:r>
+        <w:rPr>
+          <w:bCs/>
+          <w:b/>
+        </w:rPr>
+        <w:t xml:space="preserve">Job 5 Stage 2 (global average): Mapper output (key TAB value)</w:t>
+      </w:r>
+      <w:r>
+        <w:t xml:space="preserve"> </w:t>
+      </w:r>
+      <w:r>
+        <w:t xml:space="preserve">(58 lines)</w:t>
+      </w:r>
+    </w:p>
+    <w:p>
+      <w:pPr>
+        <w:pStyle w:val="SourceCode"/>
+      </w:pPr>
+      <w:r>
+        <w:rPr>
+          <w:rStyle w:val="VerbatimChar"/>
+        </w:rPr>
+        <w:t xml:space="preserve">$ python src/job5_global_mapper.py &lt; output/job5_stage1_students.txt</w:t>
+      </w:r>
+      <w:r>
+        <w:br/>
+      </w:r>
+      <w:r>
+        <w:rPr>
+          <w:rStyle w:val="VerbatimChar"/>
+        </w:rPr>
+        <w:t xml:space="preserve">ALL    306.00,4</w:t>
+      </w:r>
+      <w:r>
+        <w:br/>
+      </w:r>
+      <w:r>
+        <w:rPr>
+          <w:rStyle w:val="VerbatimChar"/>
+        </w:rPr>
+        <w:t xml:space="preserve">ALL    96.00,1</w:t>
+      </w:r>
+      <w:r>
+        <w:br/>
+      </w:r>
+      <w:r>
+        <w:rPr>
+          <w:rStyle w:val="VerbatimChar"/>
+        </w:rPr>
+        <w:t xml:space="preserve">ALL    92.00,3</w:t>
+      </w:r>
+      <w:r>
+        <w:br/>
+      </w:r>
+      <w:r>
+        <w:rPr>
+          <w:rStyle w:val="VerbatimChar"/>
+        </w:rPr>
+        <w:t xml:space="preserve">... (55 more lines)</w:t>
+      </w:r>
+    </w:p>
+    <w:p>
+      <w:pPr>
+        <w:pStyle w:val="FirstParagraph"/>
+      </w:pPr>
+      <w:r>
+        <w:rPr>
+          <w:bCs/>
+          <w:b/>
+        </w:rPr>
+        <w:t xml:space="preserve">Job 5 Stage 2 (global average): after Shuffle &amp; Sort (grouped by key)</w:t>
+      </w:r>
+      <w:r>
+        <w:t xml:space="preserve"> </w:t>
+      </w:r>
+      <w:r>
+        <w:t xml:space="preserve">(58 lines)</w:t>
+      </w:r>
+    </w:p>
+    <w:p>
+      <w:pPr>
+        <w:pStyle w:val="SourceCode"/>
+      </w:pPr>
+      <w:r>
+        <w:rPr>
+          <w:rStyle w:val="VerbatimChar"/>
+        </w:rPr>
+        <w:t xml:space="preserve">$ ... | sort</w:t>
+      </w:r>
+      <w:r>
+        <w:br/>
+      </w:r>
+      <w:r>
+        <w:rPr>
+          <w:rStyle w:val="VerbatimChar"/>
+        </w:rPr>
+        <w:t xml:space="preserve">ALL    103.00,2</w:t>
+      </w:r>
+      <w:r>
+        <w:br/>
+      </w:r>
+      <w:r>
+        <w:rPr>
+          <w:rStyle w:val="VerbatimChar"/>
+        </w:rPr>
+        <w:t xml:space="preserve">ALL    104.00,1</w:t>
+      </w:r>
+      <w:r>
+        <w:br/>
+      </w:r>
+      <w:r>
+        <w:rPr>
+          <w:rStyle w:val="VerbatimChar"/>
+        </w:rPr>
+        <w:t xml:space="preserve">ALL    107.00,1</w:t>
+      </w:r>
+      <w:r>
+        <w:br/>
+      </w:r>
+      <w:r>
+        <w:rPr>
+          <w:rStyle w:val="VerbatimChar"/>
+        </w:rPr>
+        <w:t xml:space="preserve">... (55 more lines)</w:t>
+      </w:r>
+    </w:p>
+    <w:p>
+      <w:pPr>
+        <w:pStyle w:val="FirstParagraph"/>
+      </w:pPr>
+      <w:r>
+        <w:rPr>
+          <w:bCs/>
+          <w:b/>
+        </w:rPr>
+        <w:t xml:space="preserve">Job 5 Stage 2 (global average): after Combiner (one partial sum per key)</w:t>
+      </w:r>
+      <w:r>
+        <w:t xml:space="preserve"> </w:t>
+      </w:r>
+      <w:r>
+        <w:t xml:space="preserve">(1 line)</w:t>
+      </w:r>
+    </w:p>
+    <w:p>
+      <w:pPr>
+        <w:pStyle w:val="SourceCode"/>
+      </w:pPr>
+      <w:r>
+        <w:rPr>
+          <w:rStyle w:val="VerbatimChar"/>
+        </w:rPr>
+        <w:t xml:space="preserve">$ ... | sort | python src/job1_wifi_combiner.py</w:t>
+      </w:r>
+      <w:r>
+        <w:br/>
+      </w:r>
+      <w:r>
+        <w:rPr>
+          <w:rStyle w:val="VerbatimChar"/>
+        </w:rPr>
+        <w:t xml:space="preserve">ALL    14736,160</w:t>
+      </w:r>
+    </w:p>
+    <w:p>
+      <w:pPr>
+        <w:pStyle w:val="FirstParagraph"/>
+      </w:pPr>
+      <w:r>
+        <w:rPr>
+          <w:bCs/>
+          <w:b/>
+        </w:rPr>
+        <w:t xml:space="preserve">Job 5 Stage 2 (global average): Reducer output</w:t>
+      </w:r>
+      <w:r>
+        <w:t xml:space="preserve"> </w:t>
+      </w:r>
+      <w:r>
+        <w:t xml:space="preserve">(3 lines)</w:t>
+      </w:r>
+    </w:p>
+    <w:p>
+      <w:pPr>
+        <w:pStyle w:val="SourceCode"/>
+      </w:pPr>
+      <w:r>
+        <w:rPr>
+          <w:rStyle w:val="VerbatimChar"/>
+        </w:rPr>
+        <w:t xml:space="preserve">$ ... | sort | python src/job5_global_reducer.py</w:t>
+      </w:r>
+      <w:r>
+        <w:br/>
+      </w:r>
+      <w:r>
+        <w:rPr>
+          <w:rStyle w:val="VerbatimChar"/>
+        </w:rPr>
+        <w:t xml:space="preserve">OverallAvgMin    92.1000</w:t>
+      </w:r>
+      <w:r>
+        <w:br/>
+      </w:r>
+      <w:r>
+        <w:rPr>
+          <w:rStyle w:val="VerbatimChar"/>
+        </w:rPr>
+        <w:t xml:space="preserve">TotalDurationMin    14736.00</w:t>
+      </w:r>
+      <w:r>
+        <w:br/>
+      </w:r>
+      <w:r>
+        <w:rPr>
+          <w:rStyle w:val="VerbatimChar"/>
+        </w:rPr>
+        <w:t xml:space="preserve">Visits    160</w:t>
+      </w:r>
+    </w:p>
+    <w:p>
+      <w:pPr>
+        <w:pStyle w:val="FirstParagraph"/>
+      </w:pPr>
+      <w:r>
+        <w:t xml:space="preserve">Threshold = 1.5 x 92.10 =</w:t>
+      </w:r>
+      <w:r>
+        <w:t xml:space="preserve"> </w:t>
+      </w:r>
+      <w:r>
+        <w:rPr>
+          <w:bCs/>
+          <w:b/>
+        </w:rPr>
+        <w:t xml:space="preserve">138.15 min</w:t>
+      </w:r>
+      <w:r>
+        <w:t xml:space="preserve">. The global average file is passed to every filter mapper (</w:t>
+      </w:r>
+      <w:r>
+        <w:rPr>
+          <w:rStyle w:val="VerbatimChar"/>
+        </w:rPr>
+        <w:t xml:space="preserve">-files global_avg.txt</w:t>
+      </w:r>
+      <w:r>
+        <w:t xml:space="preserve">).</w:t>
+      </w:r>
+    </w:p>
+    <w:p>
+      <w:pPr>
+        <w:pStyle w:val="BodyText"/>
+      </w:pPr>
+      <w:r>
+        <w:rPr>
+          <w:bCs/>
+          <w:b/>
+        </w:rPr>
+        <w:t xml:space="preserve">Job 5 Stage 3 (filter): input (output/job5_stage1_students.txt)</w:t>
+      </w:r>
+      <w:r>
+        <w:t xml:space="preserve"> </w:t>
+      </w:r>
+      <w:r>
+        <w:t xml:space="preserve">(58 lines)</w:t>
+      </w:r>
+    </w:p>
+    <w:p>
+      <w:pPr>
+        <w:pStyle w:val="SourceCode"/>
+      </w:pPr>
+      <w:r>
+        <w:rPr>
+          <w:rStyle w:val="VerbatimChar"/>
+        </w:rPr>
+        <w:t xml:space="preserve">$ head output/job5_stage1_students.txt</w:t>
+      </w:r>
+      <w:r>
+        <w:br/>
+      </w:r>
+      <w:r>
+        <w:rPr>
+          <w:rStyle w:val="VerbatimChar"/>
+        </w:rPr>
+        <w:t xml:space="preserve">S101    306.00,4</w:t>
+      </w:r>
+      <w:r>
+        <w:br/>
+      </w:r>
+      <w:r>
+        <w:rPr>
+          <w:rStyle w:val="VerbatimChar"/>
+        </w:rPr>
+        <w:t xml:space="preserve">S102    96.00,1</w:t>
+      </w:r>
+      <w:r>
+        <w:br/>
+      </w:r>
+      <w:r>
+        <w:rPr>
+          <w:rStyle w:val="VerbatimChar"/>
+        </w:rPr>
+        <w:t xml:space="preserve">S103    92.00,3</w:t>
+      </w:r>
+      <w:r>
+        <w:br/>
+      </w:r>
+      <w:r>
+        <w:rPr>
+          <w:rStyle w:val="VerbatimChar"/>
+        </w:rPr>
+        <w:t xml:space="preserve">... (55 more lines)</w:t>
+      </w:r>
+    </w:p>
+    <w:p>
+      <w:pPr>
+        <w:pStyle w:val="FirstParagraph"/>
+      </w:pPr>
+      <w:r>
+        <w:rPr>
+          <w:bCs/>
+          <w:b/>
+        </w:rPr>
+        <w:t xml:space="preserve">Job 5 Stage 3 (filter): Mapper output (key TAB value)</w:t>
+      </w:r>
+      <w:r>
+        <w:t xml:space="preserve"> </w:t>
+      </w:r>
+      <w:r>
+        <w:t xml:space="preserve">(4 lines)</w:t>
+      </w:r>
+    </w:p>
+    <w:p>
+      <w:pPr>
+        <w:pStyle w:val="SourceCode"/>
+      </w:pPr>
+      <w:r>
+        <w:rPr>
+          <w:rStyle w:val="VerbatimChar"/>
+        </w:rPr>
+        <w:t xml:space="preserve">$ python src/job5_filter_mapper.py &lt; output/job5_stage1_students.txt</w:t>
+      </w:r>
+      <w:r>
+        <w:br/>
+      </w:r>
+      <w:r>
+        <w:rPr>
+          <w:rStyle w:val="VerbatimChar"/>
+        </w:rPr>
+        <w:t xml:space="preserve">S107    181.83,92.10,1.97</w:t>
+      </w:r>
+      <w:r>
+        <w:br/>
+      </w:r>
+      <w:r>
+        <w:rPr>
+          <w:rStyle w:val="VerbatimChar"/>
+        </w:rPr>
+        <w:t xml:space="preserve">S123    205.11,92.10,2.23</w:t>
+      </w:r>
+      <w:r>
+        <w:br/>
+      </w:r>
+      <w:r>
+        <w:rPr>
+          <w:rStyle w:val="VerbatimChar"/>
+        </w:rPr>
+        <w:t xml:space="preserve">S131    218.00,92.10,2.37</w:t>
+      </w:r>
+      <w:r>
+        <w:br/>
+      </w:r>
+      <w:r>
+        <w:rPr>
+          <w:rStyle w:val="VerbatimChar"/>
+        </w:rPr>
+        <w:t xml:space="preserve">S148    223.43,92.10,2.43</w:t>
+      </w:r>
+    </w:p>
+    <w:p>
+      <w:pPr>
+        <w:pStyle w:val="FirstParagraph"/>
+      </w:pPr>
+      <w:r>
+        <w:rPr>
+          <w:bCs/>
+          <w:b/>
+        </w:rPr>
+        <w:t xml:space="preserve">Job 5 Stage 3 (filter): after Shuffle &amp; Sort (grouped by key)</w:t>
+      </w:r>
+      <w:r>
+        <w:t xml:space="preserve"> </w:t>
+      </w:r>
+      <w:r>
+        <w:t xml:space="preserve">(4 lines)</w:t>
+      </w:r>
+    </w:p>
+    <w:p>
+      <w:pPr>
+        <w:pStyle w:val="SourceCode"/>
+      </w:pPr>
+      <w:r>
+        <w:rPr>
+          <w:rStyle w:val="VerbatimChar"/>
+        </w:rPr>
+        <w:t xml:space="preserve">$ ... | sort</w:t>
+      </w:r>
+      <w:r>
+        <w:br/>
+      </w:r>
+      <w:r>
+        <w:rPr>
+          <w:rStyle w:val="VerbatimChar"/>
+        </w:rPr>
+        <w:t xml:space="preserve">S107    181.83,92.10,1.97</w:t>
+      </w:r>
+      <w:r>
+        <w:br/>
+      </w:r>
+      <w:r>
+        <w:rPr>
+          <w:rStyle w:val="VerbatimChar"/>
+        </w:rPr>
+        <w:t xml:space="preserve">S123    205.11,92.10,2.23</w:t>
+      </w:r>
+      <w:r>
+        <w:br/>
+      </w:r>
+      <w:r>
+        <w:rPr>
+          <w:rStyle w:val="VerbatimChar"/>
+        </w:rPr>
+        <w:t xml:space="preserve">S131    218.00,92.10,2.37</w:t>
+      </w:r>
+      <w:r>
+        <w:br/>
+      </w:r>
+      <w:r>
+        <w:rPr>
+          <w:rStyle w:val="VerbatimChar"/>
+        </w:rPr>
+        <w:t xml:space="preserve">S148    223.43,92.10,2.43</w:t>
+      </w:r>
+    </w:p>
+    <w:p>
+      <w:pPr>
+        <w:pStyle w:val="FirstParagraph"/>
+      </w:pPr>
+      <w:r>
+        <w:rPr>
+          <w:bCs/>
+          <w:b/>
+        </w:rPr>
+        <w:t xml:space="preserve">Job 5 Stage 3 (filter): Reducer output</w:t>
+      </w:r>
+      <w:r>
+        <w:t xml:space="preserve"> </w:t>
+      </w:r>
+      <w:r>
+        <w:t xml:space="preserve">(4 lines)</w:t>
+      </w:r>
+    </w:p>
+    <w:p>
+      <w:pPr>
+        <w:pStyle w:val="SourceCode"/>
+      </w:pPr>
+      <w:r>
+        <w:rPr>
+          <w:rStyle w:val="VerbatimChar"/>
+        </w:rPr>
+        <w:t xml:space="preserve">$ ... | sort | python src/job5_filter_reducer.py</w:t>
+      </w:r>
+      <w:r>
+        <w:br/>
+      </w:r>
+      <w:r>
+        <w:rPr>
+          <w:rStyle w:val="VerbatimChar"/>
+        </w:rPr>
+        <w:t xml:space="preserve">S107    AvgVisitMin=181.83,OverallAvgMin=92.10,Ratio=1.97x,Flag=ANOMALY</w:t>
+      </w:r>
+      <w:r>
+        <w:br/>
+      </w:r>
+      <w:r>
+        <w:rPr>
+          <w:rStyle w:val="VerbatimChar"/>
+        </w:rPr>
+        <w:t xml:space="preserve">S123    AvgVisitMin=205.11,OverallAvgMin=92.10,Ratio=2.23x,Flag=ANOMALY</w:t>
+      </w:r>
+      <w:r>
+        <w:br/>
+      </w:r>
+      <w:r>
+        <w:rPr>
+          <w:rStyle w:val="VerbatimChar"/>
+        </w:rPr>
+        <w:t xml:space="preserve">S131    AvgVisitMin=218.00,OverallAvgMin=92.10,Ratio=2.37x,Flag=ANOMALY</w:t>
+      </w:r>
+      <w:r>
+        <w:br/>
+      </w:r>
+      <w:r>
+        <w:rPr>
+          <w:rStyle w:val="VerbatimChar"/>
+        </w:rPr>
+        <w:t xml:space="preserve">S148    AvgVisitMin=223.43,OverallAvgMin=92.10,Ratio=2.43x,Flag=ANOMALY</w:t>
+      </w:r>
+    </w:p>
+    <w:p>
+      <w:pPr>
+        <w:pStyle w:val="FirstParagraph"/>
+      </w:pPr>
+      <w:r>
+        <w:rPr>
+          <w:bCs/>
+          <w:b/>
+        </w:rPr>
+        <w:t xml:space="preserve">Answer: students above 1.5 x the overall average</w:t>
+      </w:r>
+      <w:r>
+        <w:t xml:space="preserve"> </w:t>
+      </w:r>
+      <w:r>
+        <w:t xml:space="preserve">(4 lines)</w:t>
+      </w:r>
+    </w:p>
+    <w:p>
+      <w:pPr>
+        <w:pStyle w:val="SourceCode"/>
+      </w:pPr>
+      <w:r>
+        <w:rPr>
+          <w:rStyle w:val="VerbatimChar"/>
+        </w:rPr>
+        <w:t xml:space="preserve">S107    AvgVisitMin=181.83,OverallAvgMin=92.10,Ratio=1.97x,Flag=ANOMALY</w:t>
+      </w:r>
+      <w:r>
+        <w:br/>
+      </w:r>
+      <w:r>
+        <w:rPr>
+          <w:rStyle w:val="VerbatimChar"/>
+        </w:rPr>
+        <w:t xml:space="preserve">S123    AvgVisitMin=205.11,OverallAvgMin=92.10,Ratio=2.23x,Flag=ANOMALY</w:t>
+      </w:r>
+      <w:r>
+        <w:br/>
+      </w:r>
+      <w:r>
+        <w:rPr>
+          <w:rStyle w:val="VerbatimChar"/>
+        </w:rPr>
+        <w:t xml:space="preserve">S131    AvgVisitMin=218.00,OverallAvgMin=92.10,Ratio=2.37x,Flag=ANOMALY</w:t>
+      </w:r>
+      <w:r>
+        <w:br/>
+      </w:r>
+      <w:r>
+        <w:rPr>
+          <w:rStyle w:val="VerbatimChar"/>
+        </w:rPr>
+        <w:t xml:space="preserve">S148    AvgVisitMin=223.43,OverallAvgMin=92.10,Ratio=2.43x,Flag=ANOMALY</w:t>
+      </w:r>
+    </w:p>
+    <w:bookmarkEnd w:id="42"/>
+    <w:bookmarkStart w:id="43" w:name="job-6-transport-congestion"/>
+    <w:p>
+      <w:pPr>
+        <w:pStyle w:val="Heading2"/>
+      </w:pPr>
+      <w:r>
+        <w:t xml:space="preserve">Job 6: Transport Congestion</w:t>
+      </w:r>
+    </w:p>
+    <w:p>
+      <w:pPr>
+        <w:pStyle w:val="FirstParagraph"/>
+      </w:pPr>
+      <w:r>
+        <w:rPr>
+          <w:bCs/>
+          <w:b/>
+        </w:rPr>
+        <w:t xml:space="preserve">Job 6: input (data/transport.csv)</w:t>
+      </w:r>
+      <w:r>
+        <w:t xml:space="preserve"> </w:t>
+      </w:r>
+      <w:r>
+        <w:t xml:space="preserve">(1053 lines)</w:t>
+      </w:r>
+    </w:p>
+    <w:p>
+      <w:pPr>
+        <w:pStyle w:val="SourceCode"/>
+      </w:pPr>
+      <w:r>
+        <w:rPr>
+          <w:rStyle w:val="VerbatimChar"/>
+        </w:rPr>
+        <w:t xml:space="preserve">$ head data/transport.csv</w:t>
+      </w:r>
+      <w:r>
+        <w:br/>
+      </w:r>
+      <w:r>
+        <w:rPr>
+          <w:rStyle w:val="VerbatimChar"/>
+        </w:rPr>
+        <w:t xml:space="preserve">VehicleID,Timestamp,RouteID,SpeedKmph</w:t>
+      </w:r>
+      <w:r>
+        <w:br/>
+      </w:r>
+      <w:r>
+        <w:rPr>
+          <w:rStyle w:val="VerbatimChar"/>
+        </w:rPr>
+        <w:t xml:space="preserve">BUS03,2026-08-10 07:00,R02,24.7</w:t>
+      </w:r>
+      <w:r>
+        <w:br/>
+      </w:r>
+      <w:r>
+        <w:rPr>
+          <w:rStyle w:val="VerbatimChar"/>
+        </w:rPr>
+        <w:t xml:space="preserve">BUS05,2026-08-10 07:01,R03,40.0</w:t>
+      </w:r>
+      <w:r>
+        <w:br/>
+      </w:r>
+      <w:r>
+        <w:rPr>
+          <w:rStyle w:val="VerbatimChar"/>
+        </w:rPr>
+        <w:t xml:space="preserve">... (1050 more lines)</w:t>
+      </w:r>
+    </w:p>
+    <w:p>
+      <w:pPr>
+        <w:pStyle w:val="FirstParagraph"/>
+      </w:pPr>
+      <w:r>
+        <w:rPr>
+          <w:bCs/>
+          <w:b/>
+        </w:rPr>
+        <w:t xml:space="preserve">Job 6: Mapper output (key TAB value)</w:t>
+      </w:r>
+      <w:r>
+        <w:t xml:space="preserve"> </w:t>
+      </w:r>
+      <w:r>
+        <w:t xml:space="preserve">(1050 lines)</w:t>
+      </w:r>
+    </w:p>
+    <w:p>
+      <w:pPr>
+        <w:pStyle w:val="SourceCode"/>
+      </w:pPr>
+      <w:r>
+        <w:rPr>
+          <w:rStyle w:val="VerbatimChar"/>
+        </w:rPr>
+        <w:t xml:space="preserve">$ python src/job6_transport_mapper.py &lt; data/transport.csv</w:t>
+      </w:r>
+      <w:r>
+        <w:br/>
+      </w:r>
+      <w:r>
+        <w:rPr>
+          <w:rStyle w:val="VerbatimChar"/>
+        </w:rPr>
+        <w:t xml:space="preserve">R02-07    24.7,1</w:t>
+      </w:r>
+      <w:r>
+        <w:br/>
+      </w:r>
+      <w:r>
+        <w:rPr>
+          <w:rStyle w:val="VerbatimChar"/>
+        </w:rPr>
+        <w:t xml:space="preserve">R03-07    40.0,1</w:t>
+      </w:r>
+      <w:r>
+        <w:br/>
+      </w:r>
+      <w:r>
+        <w:rPr>
+          <w:rStyle w:val="VerbatimChar"/>
+        </w:rPr>
+        <w:t xml:space="preserve">R05-07    25.9,1</w:t>
+      </w:r>
+      <w:r>
+        <w:br/>
+      </w:r>
+      <w:r>
+        <w:rPr>
+          <w:rStyle w:val="VerbatimChar"/>
+        </w:rPr>
+        <w:t xml:space="preserve">... (1047 more lines)</w:t>
+      </w:r>
+    </w:p>
+    <w:p>
+      <w:pPr>
+        <w:pStyle w:val="FirstParagraph"/>
+      </w:pPr>
+      <w:r>
+        <w:t xml:space="preserve">Malformed records rejected by the mapper:</w:t>
+      </w:r>
+      <w:r>
+        <w:t xml:space="preserve"> </w:t>
+      </w:r>
+      <w:r>
+        <w:rPr>
+          <w:bCs/>
+          <w:b/>
+        </w:rPr>
+        <w:t xml:space="preserve">1</w:t>
+      </w:r>
+    </w:p>
+    <w:p>
+      <w:pPr>
+        <w:pStyle w:val="BodyText"/>
+      </w:pPr>
+      <w:r>
+        <w:rPr>
+          <w:bCs/>
+          <w:b/>
+        </w:rPr>
+        <w:t xml:space="preserve">Job 6: after Shuffle &amp; Sort (grouped by key)</w:t>
+      </w:r>
+      <w:r>
+        <w:t xml:space="preserve"> </w:t>
+      </w:r>
+      <w:r>
+        <w:t xml:space="preserve">(1050 lines)</w:t>
+      </w:r>
+    </w:p>
+    <w:p>
+      <w:pPr>
+        <w:pStyle w:val="SourceCode"/>
+      </w:pPr>
+      <w:r>
+        <w:rPr>
+          <w:rStyle w:val="VerbatimChar"/>
+        </w:rPr>
+        <w:t xml:space="preserve">$ ... | sort</w:t>
+      </w:r>
+      <w:r>
+        <w:br/>
+      </w:r>
+      <w:r>
+        <w:rPr>
+          <w:rStyle w:val="VerbatimChar"/>
+        </w:rPr>
+        <w:t xml:space="preserve">R01-07    29.1,1</w:t>
+      </w:r>
+      <w:r>
+        <w:br/>
+      </w:r>
+      <w:r>
+        <w:rPr>
+          <w:rStyle w:val="VerbatimChar"/>
+        </w:rPr>
+        <w:t xml:space="preserve">R01-07    29.6,1</w:t>
+      </w:r>
+      <w:r>
+        <w:br/>
+      </w:r>
+      <w:r>
+        <w:rPr>
+          <w:rStyle w:val="VerbatimChar"/>
+        </w:rPr>
+        <w:t xml:space="preserve">R01-07    29.8,1</w:t>
+      </w:r>
+      <w:r>
+        <w:br/>
+      </w:r>
+      <w:r>
+        <w:rPr>
+          <w:rStyle w:val="VerbatimChar"/>
+        </w:rPr>
+        <w:t xml:space="preserve">... (1047 more lines)</w:t>
+      </w:r>
+    </w:p>
+    <w:p>
+      <w:pPr>
+        <w:pStyle w:val="FirstParagraph"/>
+      </w:pPr>
+      <w:r>
+        <w:rPr>
+          <w:bCs/>
+          <w:b/>
+        </w:rPr>
+        <w:t xml:space="preserve">Job 6: after Combiner (one partial sum per key)</w:t>
+      </w:r>
+      <w:r>
+        <w:t xml:space="preserve"> </w:t>
+      </w:r>
+      <w:r>
+        <w:t xml:space="preserve">(70 lines)</w:t>
+      </w:r>
+    </w:p>
+    <w:p>
+      <w:pPr>
+        <w:pStyle w:val="SourceCode"/>
+      </w:pPr>
+      <w:r>
+        <w:rPr>
+          <w:rStyle w:val="VerbatimChar"/>
+        </w:rPr>
+        <w:t xml:space="preserve">$ ... | sort | python src/job1_wifi_combiner.py</w:t>
+      </w:r>
+      <w:r>
+        <w:br/>
+      </w:r>
+      <w:r>
+        <w:rPr>
+          <w:rStyle w:val="VerbatimChar"/>
+        </w:rPr>
+        <w:t xml:space="preserve">R01-07    494.3,15</w:t>
+      </w:r>
+      <w:r>
+        <w:br/>
+      </w:r>
+      <w:r>
+        <w:rPr>
+          <w:rStyle w:val="VerbatimChar"/>
+        </w:rPr>
+        <w:t xml:space="preserve">R01-08    267.6,15</w:t>
+      </w:r>
+      <w:r>
+        <w:br/>
+      </w:r>
+      <w:r>
+        <w:rPr>
+          <w:rStyle w:val="VerbatimChar"/>
+        </w:rPr>
+        <w:t xml:space="preserve">R01-09    318.5,15</w:t>
+      </w:r>
+      <w:r>
+        <w:br/>
+      </w:r>
+      <w:r>
+        <w:rPr>
+          <w:rStyle w:val="VerbatimChar"/>
+        </w:rPr>
+        <w:t xml:space="preserve">... (67 more lines)</w:t>
+      </w:r>
+    </w:p>
+    <w:p>
+      <w:pPr>
+        <w:pStyle w:val="FirstParagraph"/>
+      </w:pPr>
+      <w:r>
+        <w:rPr>
+          <w:bCs/>
+          <w:b/>
+        </w:rPr>
+        <w:t xml:space="preserve">Job 6: Reducer output</w:t>
+      </w:r>
+      <w:r>
+        <w:t xml:space="preserve"> </w:t>
+      </w:r>
+      <w:r>
+        <w:t xml:space="preserve">(70 lines)</w:t>
+      </w:r>
+    </w:p>
+    <w:p>
+      <w:pPr>
+        <w:pStyle w:val="SourceCode"/>
+      </w:pPr>
+      <w:r>
+        <w:rPr>
+          <w:rStyle w:val="VerbatimChar"/>
+        </w:rPr>
+        <w:t xml:space="preserve">$ ... | sort | python src/job6_transport_reducer.py</w:t>
+      </w:r>
+      <w:r>
+        <w:br/>
+      </w:r>
+      <w:r>
+        <w:rPr>
+          <w:rStyle w:val="VerbatimChar"/>
+        </w:rPr>
+        <w:t xml:space="preserve">R01-07    AvgSpeedKmph=32.95,Readings=15,Status=NORMAL</w:t>
+      </w:r>
+      <w:r>
+        <w:br/>
+      </w:r>
+      <w:r>
+        <w:rPr>
+          <w:rStyle w:val="VerbatimChar"/>
+        </w:rPr>
+        <w:t xml:space="preserve">R01-08    AvgSpeedKmph=17.84,Readings=15,Status=CONGESTED</w:t>
+      </w:r>
+      <w:r>
+        <w:br/>
+      </w:r>
+      <w:r>
+        <w:rPr>
+          <w:rStyle w:val="VerbatimChar"/>
+        </w:rPr>
+        <w:t xml:space="preserve">R01-09    AvgSpeedKmph=21.23,Readings=15,Status=NORMAL</w:t>
+      </w:r>
+      <w:r>
+        <w:br/>
+      </w:r>
+      <w:r>
+        <w:rPr>
+          <w:rStyle w:val="VerbatimChar"/>
+        </w:rPr>
+        <w:t xml:space="preserve">... (67 more lines)</w:t>
+      </w:r>
+    </w:p>
+    <w:p>
+      <w:pPr>
+        <w:pStyle w:val="FirstParagraph"/>
+      </w:pPr>
+      <w:r>
+        <w:rPr>
+          <w:bCs/>
+          <w:b/>
+        </w:rPr>
+        <w:t xml:space="preserve">Answer: 14 of 70 route-hours are congested (avg speed &lt; 20 km/h)</w:t>
+      </w:r>
+      <w:r>
+        <w:t xml:space="preserve"> </w:t>
+      </w:r>
+      <w:r>
+        <w:t xml:space="preserve">(14 lines)</w:t>
+      </w:r>
+    </w:p>
+    <w:p>
+      <w:pPr>
+        <w:pStyle w:val="SourceCode"/>
+      </w:pPr>
+      <w:r>
+        <w:rPr>
+          <w:rStyle w:val="VerbatimChar"/>
+        </w:rPr>
+        <w:t xml:space="preserve">R01-08    AvgSpeedKmph=17.84,Readings=15,Status=CONGESTED</w:t>
+      </w:r>
+      <w:r>
+        <w:br/>
+      </w:r>
+      <w:r>
+        <w:rPr>
+          <w:rStyle w:val="VerbatimChar"/>
+        </w:rPr>
+        <w:t xml:space="preserve">R01-17    AvgSpeedKmph=19.03,Readings=15,Status=CONGESTED</w:t>
+      </w:r>
+      <w:r>
+        <w:br/>
+      </w:r>
+      <w:r>
+        <w:rPr>
+          <w:rStyle w:val="VerbatimChar"/>
+        </w:rPr>
+        <w:t xml:space="preserve">R02-08    AvgSpeedKmph=15.29,Readings=15,Status=CONGESTED</w:t>
+      </w:r>
+      <w:r>
+        <w:br/>
+      </w:r>
+      <w:r>
+        <w:rPr>
+          <w:rStyle w:val="VerbatimChar"/>
+        </w:rPr>
+        <w:t xml:space="preserve">R02-09    AvgSpeedKmph=18.26,Readings=15,Status=CONGESTED</w:t>
+      </w:r>
+      <w:r>
+        <w:br/>
+      </w:r>
+      <w:r>
+        <w:rPr>
+          <w:rStyle w:val="VerbatimChar"/>
+        </w:rPr>
+        <w:t xml:space="preserve">R02-17    AvgSpeedKmph=16.96,Readings=15,Status=CONGESTED</w:t>
+      </w:r>
+      <w:r>
+        <w:br/>
+      </w:r>
+      <w:r>
+        <w:rPr>
+          <w:rStyle w:val="VerbatimChar"/>
+        </w:rPr>
+        <w:t xml:space="preserve">R02-18    AvgSpeedKmph=19.16,Readings=15,Status=CONGESTED</w:t>
+      </w:r>
+      <w:r>
+        <w:br/>
+      </w:r>
+      <w:r>
+        <w:rPr>
+          <w:rStyle w:val="VerbatimChar"/>
+        </w:rPr>
+        <w:t xml:space="preserve">R03-08    AvgSpeedKmph=18.83,Readings=15,Status=CONGESTED</w:t>
+      </w:r>
+      <w:r>
+        <w:br/>
+      </w:r>
+      <w:r>
+        <w:rPr>
+          <w:rStyle w:val="VerbatimChar"/>
+        </w:rPr>
+        <w:t xml:space="preserve">R04-08    AvgSpeedKmph=13.08,Readings=15,Status=CONGESTED</w:t>
+      </w:r>
+      <w:r>
+        <w:br/>
+      </w:r>
+      <w:r>
+        <w:rPr>
+          <w:rStyle w:val="VerbatimChar"/>
+        </w:rPr>
+        <w:t xml:space="preserve">R04-09    AvgSpeedKmph=15.37,Readings=15,Status=CONGESTED</w:t>
+      </w:r>
+      <w:r>
+        <w:br/>
+      </w:r>
+      <w:r>
+        <w:rPr>
+          <w:rStyle w:val="VerbatimChar"/>
+        </w:rPr>
+        <w:t xml:space="preserve">R04-17    AvgSpeedKmph=14.57,Readings=15,Status=CONGESTED</w:t>
+      </w:r>
+      <w:r>
+        <w:br/>
+      </w:r>
+      <w:r>
+        <w:rPr>
+          <w:rStyle w:val="VerbatimChar"/>
+        </w:rPr>
+        <w:t xml:space="preserve">R04-18    AvgSpeedKmph=16.17,Readings=15,Status=CONGESTED</w:t>
+      </w:r>
+      <w:r>
+        <w:br/>
+      </w:r>
+      <w:r>
+        <w:rPr>
+          <w:rStyle w:val="VerbatimChar"/>
+        </w:rPr>
+        <w:t xml:space="preserve">R05-08    AvgSpeedKmph=16.86,Readings=15,Status=CONGESTED</w:t>
+      </w:r>
+      <w:r>
+        <w:br/>
+      </w:r>
+      <w:r>
+        <w:rPr>
+          <w:rStyle w:val="VerbatimChar"/>
+        </w:rPr>
+        <w:t xml:space="preserve">R05-09    AvgSpeedKmph=19.72,Readings=15,Status=CONGESTED</w:t>
+      </w:r>
+      <w:r>
+        <w:br/>
+      </w:r>
+      <w:r>
+        <w:rPr>
+          <w:rStyle w:val="VerbatimChar"/>
+        </w:rPr>
+        <w:t xml:space="preserve">R05-17    AvgSpeedKmph=18.10,Readings=15,Status=CONGESTED</w:t>
+      </w:r>
+    </w:p>
+    <w:bookmarkEnd w:id="43"/>
+    <w:bookmarkStart w:id="44" w:name="verification"/>
+    <w:p>
+      <w:pPr>
+        <w:pStyle w:val="Heading2"/>
+      </w:pPr>
+      <w:r>
+        <w:t xml:space="preserve">Verification</w:t>
+      </w:r>
+    </w:p>
+    <w:p>
+      <w:pPr>
+        <w:pStyle w:val="FirstParagraph"/>
+      </w:pPr>
+      <w:r>
+        <w:rPr>
+          <w:rStyle w:val="VerbatimChar"/>
+        </w:rPr>
+        <w:t xml:space="preserve">scripts/verify.py</w:t>
+      </w:r>
+      <w:r>
+        <w:t xml:space="preserve"> </w:t>
+      </w:r>
+      <w:r>
+        <w:t xml:space="preserve">recomputes every answer with plain Python (no MapReduce) and compares it with the files in output/:</w:t>
+      </w:r>
+    </w:p>
+    <w:p>
+      <w:pPr>
+        <w:pStyle w:val="SourceCode"/>
+      </w:pPr>
+      <w:r>
+        <w:rPr>
+          <w:rStyle w:val="VerbatimChar"/>
+        </w:rPr>
+        <w:t xml:space="preserve">$ python scripts/verify.py</w:t>
+      </w:r>
+      <w:r>
+        <w:br/>
+      </w:r>
+      <w:r>
+        <w:rPr>
+          <w:rStyle w:val="VerbatimChar"/>
+        </w:rPr>
+        <w:t xml:space="preserve">Job 1: PASS</w:t>
+      </w:r>
+      <w:r>
+        <w:br/>
+      </w:r>
+      <w:r>
+        <w:rPr>
+          <w:rStyle w:val="VerbatimChar"/>
+        </w:rPr>
+        <w:t xml:space="preserve">Job 2: PASS</w:t>
+      </w:r>
+      <w:r>
+        <w:br/>
+      </w:r>
+      <w:r>
+        <w:rPr>
+          <w:rStyle w:val="VerbatimChar"/>
+        </w:rPr>
+        <w:t xml:space="preserve">Job 3: PASS</w:t>
+      </w:r>
+      <w:r>
+        <w:br/>
+      </w:r>
+      <w:r>
+        <w:rPr>
+          <w:rStyle w:val="VerbatimChar"/>
+        </w:rPr>
+        <w:t xml:space="preserve">Job 4: PASS</w:t>
+      </w:r>
+      <w:r>
+        <w:br/>
+      </w:r>
+      <w:r>
+        <w:rPr>
+          <w:rStyle w:val="VerbatimChar"/>
+        </w:rPr>
+        <w:t xml:space="preserve">Job 5: PASS</w:t>
+      </w:r>
+      <w:r>
+        <w:br/>
+      </w:r>
+      <w:r>
+        <w:rPr>
+          <w:rStyle w:val="VerbatimChar"/>
+        </w:rPr>
+        <w:t xml:space="preserve">Job 6: PASS</w:t>
+      </w:r>
+    </w:p>
+    <w:bookmarkEnd w:id="44"/>
+    <w:bookmarkStart w:id="45" w:name="combiner-and-multiple-reducers"/>
+    <w:p>
+      <w:pPr>
+        <w:pStyle w:val="Heading2"/>
+      </w:pPr>
+      <w:r>
+        <w:t xml:space="preserve">Combiner and Multiple Reducers</w:t>
+      </w:r>
+    </w:p>
+    <w:p>
+      <w:pPr>
+        <w:pStyle w:val="FirstParagraph"/>
+      </w:pPr>
+      <w:r>
+        <w:rPr>
+          <w:rStyle w:val="VerbatimChar"/>
+        </w:rPr>
+        <w:t xml:space="preserve">scripts/compare_combiner.sh</w:t>
+      </w:r>
+      <w:r>
+        <w:t xml:space="preserve"> </w:t>
+      </w:r>
+      <w:r>
+        <w:t xml:space="preserve">splits the Wi-Fi log into 4 map tasks, counts the records shuffled with and without the combiner, and runs Job 1 with 3 reducers:</w:t>
+      </w:r>
+    </w:p>
+    <w:p>
+      <w:pPr>
+        <w:pStyle w:val="SourceCode"/>
+      </w:pPr>
+      <w:r>
+        <w:rPr>
+          <w:rStyle w:val="VerbatimChar"/>
+        </w:rPr>
+        <w:t xml:space="preserve">$ scripts/compare_combiner.sh</w:t>
+      </w:r>
+      <w:r>
+        <w:br/>
+      </w:r>
+      <w:r>
+        <w:rPr>
+          <w:rStyle w:val="VerbatimChar"/>
+        </w:rPr>
+        <w:t xml:space="preserve">Job 1 records shuffled without combiner: 700</w:t>
+      </w:r>
+      <w:r>
+        <w:br/>
+      </w:r>
+      <w:r>
+        <w:rPr>
+          <w:rStyle w:val="VerbatimChar"/>
+        </w:rPr>
+        <w:t xml:space="preserve">Job 1 records shuffled with combiner   : 67  (4 map tasks)</w:t>
+      </w:r>
+      <w:r>
+        <w:br/>
+      </w:r>
+      <w:r>
+        <w:rPr>
+          <w:rStyle w:val="VerbatimChar"/>
+        </w:rPr>
+        <w:t xml:space="preserve">Combiner output identical to no-combiner output: YES</w:t>
+      </w:r>
+      <w:r>
+        <w:br/>
+      </w:r>
+      <w:r>
+        <w:rPr>
+          <w:rStyle w:val="VerbatimChar"/>
+        </w:rPr>
+        <w:t xml:space="preserve">reducer 0: 23 keys</w:t>
+      </w:r>
+      <w:r>
+        <w:br/>
+      </w:r>
+      <w:r>
+        <w:rPr>
+          <w:rStyle w:val="VerbatimChar"/>
+        </w:rPr>
+        <w:t xml:space="preserve">reducer 1: 19 keys</w:t>
+      </w:r>
+      <w:r>
+        <w:br/>
+      </w:r>
+      <w:r>
+        <w:rPr>
+          <w:rStyle w:val="VerbatimChar"/>
+        </w:rPr>
+        <w:t xml:space="preserve">reducer 2: 22 keys</w:t>
+      </w:r>
+      <w:r>
+        <w:br/>
+      </w:r>
+      <w:r>
+        <w:rPr>
+          <w:rStyle w:val="VerbatimChar"/>
+        </w:rPr>
+        <w:t xml:space="preserve">3-reducer output identical to 1-reducer output: YES</w:t>
+      </w:r>
+    </w:p>
+    <w:bookmarkEnd w:id="45"/>
+    <w:bookmarkEnd w:id="46"/>
     <w:sectPr>
       <w:footerReference w:type="default" r:id="rId9"/>
       <w:pgMar w:left="1440" w:right="1440" w:top="1440" w:bottom="1440"/>
@@ -10164,11 +14455,13 @@
     <w:link w:val="VerbatimChar"/>
     <w:pPr>
       <w:wordWrap w:val="off"/>
+      <w:spacing w:before="40" w:after="160"/>
+      <w:ind w:left="360"/>
     </w:pPr>
     <w:rPr>
       <w:rFonts w:ascii="Times New Roman" w:hAnsi="Times New Roman" w:eastAsia="Times New Roman" w:cs="Times New Roman"/>
       <w:color w:val="000000"/>
-      <w:sz w:val="24"/>
+      <w:sz w:val="20"/>
     </w:rPr>
   </w:style>
   <w:style w:type="character" w:customStyle="1" w:styleId="KeywordTok">

</xml_diff>